<commit_message>
feat: :memo: Change group requirements
</commit_message>
<xml_diff>
--- a/reports/C2/Group/Group.docx
+++ b/reports/C2/Group/Group.docx
@@ -123,7 +123,7 @@
               </w:rPr>
               <w:tab/>
             </w:r>
-            <w:permStart w:id="143746294" w:edGrp="everyone"/>
+            <w:permStart w:id="1577268823" w:edGrp="everyone"/>
             <w:sdt>
               <w:sdtPr>
                 <w:rPr>
@@ -137,7 +137,6 @@
                 <w15:appearance w15:val="hidden"/>
                 <w:text/>
               </w:sdtPr>
-              <w:sdtEndPr/>
               <w:sdtContent>
                 <w:r>
                   <w:rPr>
@@ -159,7 +158,7 @@
                 </w:r>
               </w:sdtContent>
             </w:sdt>
-            <w:permEnd w:id="143746294"/>
+            <w:permEnd w:id="1577268823"/>
           </w:p>
         </w:tc>
       </w:tr>
@@ -202,7 +201,7 @@
               </w:rPr>
               <w:tab/>
             </w:r>
-            <w:permStart w:id="420692352" w:edGrp="everyone"/>
+            <w:permStart w:id="1051094094" w:edGrp="everyone"/>
             <w:sdt>
               <w:sdtPr>
                 <w:rPr>
@@ -216,7 +215,6 @@
                 <w15:appearance w15:val="hidden"/>
                 <w:text/>
               </w:sdtPr>
-              <w:sdtEndPr/>
               <w:sdtContent>
                 <w:r>
                   <w:rPr>
@@ -232,7 +230,7 @@
                 </w:r>
               </w:sdtContent>
             </w:sdt>
-            <w:permEnd w:id="420692352"/>
+            <w:permEnd w:id="1051094094"/>
           </w:p>
         </w:tc>
       </w:tr>
@@ -284,7 +282,7 @@
               </w:rPr>
               <w:tab/>
             </w:r>
-            <w:permStart w:id="291510380" w:edGrp="everyone"/>
+            <w:permStart w:id="650781575" w:edGrp="everyone"/>
             <w:sdt>
               <w:sdtPr>
                 <w:rPr>
@@ -298,7 +296,6 @@
                 <w15:appearance w15:val="hidden"/>
                 <w:text/>
               </w:sdtPr>
-              <w:sdtEndPr/>
               <w:sdtContent>
                 <w:r>
                   <w:rPr>
@@ -315,7 +312,7 @@
               </w:sdtContent>
             </w:sdt>
           </w:p>
-          <w:permEnd w:id="291510380"/>
+          <w:permEnd w:id="650781575"/>
           <w:p>
             <w:pPr>
               <w:pStyle w:val="Sinespaciado"/>
@@ -345,7 +342,7 @@
               </w:rPr>
               <w:tab/>
             </w:r>
-            <w:permStart w:id="1364481481" w:edGrp="everyone"/>
+            <w:permStart w:id="1970822259" w:edGrp="everyone"/>
             <w:sdt>
               <w:sdtPr>
                 <w:rPr>
@@ -359,7 +356,6 @@
                 <w15:appearance w15:val="hidden"/>
                 <w:text/>
               </w:sdtPr>
-              <w:sdtEndPr/>
               <w:sdtContent>
                 <w:r>
                   <w:rPr>
@@ -381,7 +377,7 @@
                 </w:r>
               </w:sdtContent>
             </w:sdt>
-            <w:permEnd w:id="1364481481"/>
+            <w:permEnd w:id="1970822259"/>
           </w:p>
           <w:p>
             <w:pPr>
@@ -410,7 +406,7 @@
               </w:rPr>
               <w:tab/>
             </w:r>
-            <w:permStart w:id="1443845444" w:edGrp="everyone"/>
+            <w:permStart w:id="1476810082" w:edGrp="everyone"/>
             <w:sdt>
               <w:sdtPr>
                 <w:rPr>
@@ -424,7 +420,6 @@
                 <w15:appearance w15:val="hidden"/>
                 <w:text/>
               </w:sdtPr>
-              <w:sdtEndPr/>
               <w:sdtContent>
                 <w:r>
                   <w:rPr>
@@ -446,7 +441,7 @@
                 </w:r>
               </w:sdtContent>
             </w:sdt>
-            <w:permEnd w:id="1443845444"/>
+            <w:permEnd w:id="1476810082"/>
             <w:r>
               <w:rPr>
                 <w:rFonts w:asciiTheme="majorHAnsi" w:hAnsiTheme="majorHAnsi" w:cstheme="majorHAnsi"/>
@@ -475,7 +470,7 @@
               </w:rPr>
               <w:tab/>
             </w:r>
-            <w:permStart w:id="415123737" w:edGrp="everyone"/>
+            <w:permStart w:id="869479214" w:edGrp="everyone"/>
             <w:sdt>
               <w:sdtPr>
                 <w:rPr>
@@ -489,7 +484,6 @@
                 <w15:appearance w15:val="hidden"/>
                 <w:text/>
               </w:sdtPr>
-              <w:sdtEndPr/>
               <w:sdtContent>
                 <w:r>
                   <w:rPr>
@@ -511,7 +505,7 @@
                 </w:r>
               </w:sdtContent>
             </w:sdt>
-            <w:permEnd w:id="415123737"/>
+            <w:permEnd w:id="869479214"/>
           </w:p>
         </w:tc>
         <w:tc>
@@ -525,266 +519,12 @@
             </w:tcMar>
           </w:tcPr>
           <w:p>
-            <w:r>
-              <w:t>Student #2</w:t>
-            </w:r>
-          </w:p>
-          <w:p>
-            <w:pPr>
-              <w:pStyle w:val="Sinespaciado"/>
-              <w:rPr>
-                <w:rFonts w:asciiTheme="majorHAnsi" w:hAnsiTheme="majorHAnsi" w:cstheme="majorHAnsi"/>
-                <w:b/>
-              </w:rPr>
-            </w:pPr>
-            <w:r>
-              <w:rPr>
-                <w:rFonts w:asciiTheme="majorHAnsi" w:hAnsiTheme="majorHAnsi" w:cstheme="majorHAnsi"/>
-                <w:b/>
-              </w:rPr>
-              <w:t>ID:</w:t>
-            </w:r>
-            <w:r>
-              <w:rPr>
-                <w:rFonts w:asciiTheme="majorHAnsi" w:hAnsiTheme="majorHAnsi" w:cstheme="majorHAnsi"/>
-                <w:b/>
-              </w:rPr>
-              <w:tab/>
-            </w:r>
-            <w:r>
-              <w:rPr>
-                <w:rFonts w:asciiTheme="majorHAnsi" w:hAnsiTheme="majorHAnsi" w:cstheme="majorHAnsi"/>
-              </w:rPr>
-              <w:tab/>
-            </w:r>
-            <w:permStart w:id="1081366304" w:edGrp="everyone"/>
-            <w:r>
-              <w:rPr>
-                <w:rFonts w:asciiTheme="majorHAnsi" w:hAnsiTheme="majorHAnsi" w:cstheme="majorHAnsi"/>
-              </w:rPr>
-              <w:t xml:space="preserve"> </w:t>
-            </w:r>
-            <w:sdt>
-              <w:sdtPr>
-                <w:rPr>
-                  <w:rFonts w:asciiTheme="majorHAnsi" w:hAnsiTheme="majorHAnsi" w:cstheme="majorBidi"/>
-                </w:rPr>
-                <w:tag w:val="ID2"/>
-                <w:id w:val="-1276937016"/>
-                <w:placeholder>
-                  <w:docPart w:val="6F786DCD649A47158871CD1D613BC7CC"/>
-                </w:placeholder>
-                <w15:appearance w15:val="hidden"/>
-                <w:text/>
-              </w:sdtPr>
-              <w:sdtEndPr/>
-              <w:sdtContent>
-                <w:r>
-                  <w:rPr>
-                    <w:rFonts w:asciiTheme="majorHAnsi" w:hAnsiTheme="majorHAnsi" w:cstheme="majorBidi"/>
-                  </w:rPr>
-                  <w:t>2958****</w:t>
-                </w:r>
-              </w:sdtContent>
-            </w:sdt>
-          </w:p>
-          <w:permEnd w:id="1081366304"/>
-          <w:p>
-            <w:pPr>
-              <w:pStyle w:val="Sinespaciado"/>
-              <w:rPr>
-                <w:rFonts w:asciiTheme="majorHAnsi" w:hAnsiTheme="majorHAnsi" w:cstheme="majorHAnsi"/>
-                <w:b/>
-              </w:rPr>
-            </w:pPr>
-            <w:r>
-              <w:rPr>
-                <w:rFonts w:asciiTheme="majorHAnsi" w:hAnsiTheme="majorHAnsi" w:cstheme="majorHAnsi"/>
-                <w:b/>
-              </w:rPr>
-              <w:t xml:space="preserve">UVUS: </w:t>
-            </w:r>
-            <w:r>
-              <w:rPr>
-                <w:rFonts w:asciiTheme="majorHAnsi" w:hAnsiTheme="majorHAnsi" w:cstheme="majorHAnsi"/>
-                <w:b/>
-              </w:rPr>
-              <w:tab/>
-            </w:r>
-            <w:r>
-              <w:rPr>
-                <w:rFonts w:asciiTheme="majorHAnsi" w:hAnsiTheme="majorHAnsi" w:cstheme="majorHAnsi"/>
-                <w:b/>
-              </w:rPr>
-              <w:tab/>
-            </w:r>
-            <w:permStart w:id="554395221" w:edGrp="everyone"/>
-            <w:sdt>
-              <w:sdtPr>
-                <w:rPr>
-                  <w:rFonts w:asciiTheme="majorHAnsi" w:hAnsiTheme="majorHAnsi" w:cstheme="majorHAnsi"/>
-                </w:rPr>
-                <w:tag w:val="UVUS02"/>
-                <w:id w:val="1381354132"/>
-                <w:placeholder>
-                  <w:docPart w:val="A5481AD88EA342BBAAB11D688719DEDB"/>
-                </w:placeholder>
-                <w15:appearance w15:val="hidden"/>
-                <w:text/>
-              </w:sdtPr>
-              <w:sdtEndPr/>
-              <w:sdtContent>
-                <w:r>
-                  <w:rPr>
-                    <w:rFonts w:asciiTheme="majorHAnsi" w:hAnsiTheme="majorHAnsi" w:cstheme="majorHAnsi"/>
-                  </w:rPr>
-                  <w:t xml:space="preserve"> </w:t>
-                </w:r>
-                <w:r>
-                  <w:rPr>
-                    <w:rFonts w:asciiTheme="majorHAnsi" w:hAnsiTheme="majorHAnsi" w:cstheme="majorHAnsi"/>
-                  </w:rPr>
-                  <w:t xml:space="preserve">GDT3477 </w:t>
-                </w:r>
-                <w:r>
-                  <w:rPr>
-                    <w:rFonts w:asciiTheme="majorHAnsi" w:hAnsiTheme="majorHAnsi" w:cstheme="majorHAnsi"/>
-                  </w:rPr>
-                  <w:t xml:space="preserve"> </w:t>
-                </w:r>
-              </w:sdtContent>
-            </w:sdt>
-            <w:permEnd w:id="554395221"/>
-          </w:p>
-          <w:p>
             <w:pPr>
               <w:pStyle w:val="Sinespaciado"/>
               <w:rPr>
                 <w:rFonts w:asciiTheme="majorHAnsi" w:hAnsiTheme="majorHAnsi" w:cstheme="majorHAnsi"/>
               </w:rPr>
             </w:pPr>
-            <w:r>
-              <w:rPr>
-                <w:rFonts w:asciiTheme="majorHAnsi" w:hAnsiTheme="majorHAnsi" w:cstheme="majorHAnsi"/>
-                <w:b/>
-              </w:rPr>
-              <w:t>Name:</w:t>
-            </w:r>
-            <w:r>
-              <w:rPr>
-                <w:rFonts w:asciiTheme="majorHAnsi" w:hAnsiTheme="majorHAnsi" w:cstheme="majorHAnsi"/>
-                <w:b/>
-              </w:rPr>
-              <w:tab/>
-            </w:r>
-            <w:r>
-              <w:rPr>
-                <w:rFonts w:asciiTheme="majorHAnsi" w:hAnsiTheme="majorHAnsi" w:cstheme="majorHAnsi"/>
-              </w:rPr>
-              <w:tab/>
-            </w:r>
-            <w:permStart w:id="84825807" w:edGrp="everyone"/>
-            <w:sdt>
-              <w:sdtPr>
-                <w:rPr>
-                  <w:rFonts w:asciiTheme="majorHAnsi" w:hAnsiTheme="majorHAnsi" w:cstheme="majorHAnsi"/>
-                </w:rPr>
-                <w:tag w:val="Student2"/>
-                <w:id w:val="2044784553"/>
-                <w:placeholder>
-                  <w:docPart w:val="E9193D3C494241F4B256126F24FB602E"/>
-                </w:placeholder>
-                <w15:appearance w15:val="hidden"/>
-                <w:text/>
-              </w:sdtPr>
-              <w:sdtEndPr/>
-              <w:sdtContent>
-                <w:r>
-                  <w:rPr>
-                    <w:rFonts w:asciiTheme="majorHAnsi" w:hAnsiTheme="majorHAnsi" w:cstheme="majorHAnsi"/>
-                  </w:rPr>
-                  <w:t xml:space="preserve"> </w:t>
-                </w:r>
-                <w:r>
-                  <w:rPr>
-                    <w:rFonts w:asciiTheme="majorHAnsi" w:hAnsiTheme="majorHAnsi" w:cstheme="majorHAnsi"/>
-                  </w:rPr>
-                  <w:t>Villalba Fernández, Jesús</w:t>
-                </w:r>
-                <w:r>
-                  <w:rPr>
-                    <w:rFonts w:asciiTheme="majorHAnsi" w:hAnsiTheme="majorHAnsi" w:cstheme="majorHAnsi"/>
-                  </w:rPr>
-                  <w:t xml:space="preserve">  </w:t>
-                </w:r>
-              </w:sdtContent>
-            </w:sdt>
-            <w:permEnd w:id="84825807"/>
-          </w:p>
-          <w:p>
-            <w:pPr>
-              <w:pStyle w:val="Sinespaciado"/>
-              <w:rPr>
-                <w:rFonts w:asciiTheme="majorHAnsi" w:hAnsiTheme="majorHAnsi" w:cstheme="majorHAnsi"/>
-              </w:rPr>
-            </w:pPr>
-            <w:r>
-              <w:rPr>
-                <w:rFonts w:asciiTheme="majorHAnsi" w:hAnsiTheme="majorHAnsi" w:cstheme="majorHAnsi"/>
-                <w:b/>
-              </w:rPr>
-              <w:t>Roles:</w:t>
-            </w:r>
-            <w:r>
-              <w:rPr>
-                <w:rFonts w:asciiTheme="majorHAnsi" w:hAnsiTheme="majorHAnsi" w:cstheme="majorHAnsi"/>
-                <w:b/>
-              </w:rPr>
-              <w:tab/>
-            </w:r>
-            <w:r>
-              <w:rPr>
-                <w:rFonts w:asciiTheme="majorHAnsi" w:hAnsiTheme="majorHAnsi" w:cstheme="majorHAnsi"/>
-              </w:rPr>
-              <w:tab/>
-            </w:r>
-            <w:permStart w:id="584389830" w:edGrp="everyone"/>
-            <w:sdt>
-              <w:sdtPr>
-                <w:rPr>
-                  <w:rFonts w:asciiTheme="majorHAnsi" w:hAnsiTheme="majorHAnsi" w:cstheme="majorHAnsi"/>
-                </w:rPr>
-                <w:tag w:val="Roles2"/>
-                <w:id w:val="-1975901162"/>
-                <w:placeholder>
-                  <w:docPart w:val="E9193D3C494241F4B256126F24FB602E"/>
-                </w:placeholder>
-                <w15:appearance w15:val="hidden"/>
-                <w:text/>
-              </w:sdtPr>
-              <w:sdtEndPr/>
-              <w:sdtContent>
-                <w:r>
-                  <w:rPr>
-                    <w:rFonts w:asciiTheme="majorHAnsi" w:hAnsiTheme="majorHAnsi" w:cstheme="majorHAnsi"/>
-                  </w:rPr>
-                  <w:t xml:space="preserve"> </w:t>
-                </w:r>
-                <w:r>
-                  <w:rPr>
-                    <w:rFonts w:asciiTheme="majorHAnsi" w:hAnsiTheme="majorHAnsi" w:cstheme="majorHAnsi"/>
-                  </w:rPr>
-                  <w:t>Analyst, developer, tester</w:t>
-                </w:r>
-                <w:r>
-                  <w:rPr>
-                    <w:rFonts w:asciiTheme="majorHAnsi" w:hAnsiTheme="majorHAnsi" w:cstheme="majorHAnsi"/>
-                  </w:rPr>
-                  <w:t xml:space="preserve">  </w:t>
-                </w:r>
-              </w:sdtContent>
-            </w:sdt>
-            <w:permEnd w:id="584389830"/>
           </w:p>
         </w:tc>
       </w:tr>
@@ -835,7 +575,7 @@
               </w:rPr>
               <w:tab/>
             </w:r>
-            <w:permStart w:id="1000832359" w:edGrp="everyone"/>
+            <w:permStart w:id="154871226" w:edGrp="everyone"/>
             <w:sdt>
               <w:sdtPr>
                 <w:rPr>
@@ -849,7 +589,6 @@
                 <w15:appearance w15:val="hidden"/>
                 <w:text/>
               </w:sdtPr>
-              <w:sdtEndPr/>
               <w:sdtContent>
                 <w:r>
                   <w:rPr>
@@ -866,7 +605,7 @@
               </w:sdtContent>
             </w:sdt>
           </w:p>
-          <w:permEnd w:id="1000832359"/>
+          <w:permEnd w:id="154871226"/>
           <w:p>
             <w:pPr>
               <w:pStyle w:val="Sinespaciado"/>
@@ -896,7 +635,7 @@
               </w:rPr>
               <w:tab/>
             </w:r>
-            <w:permStart w:id="926035648" w:edGrp="everyone"/>
+            <w:permStart w:id="1640057369" w:edGrp="everyone"/>
             <w:sdt>
               <w:sdtPr>
                 <w:rPr>
@@ -910,7 +649,6 @@
                 <w15:appearance w15:val="hidden"/>
                 <w:text/>
               </w:sdtPr>
-              <w:sdtEndPr/>
               <w:sdtContent>
                 <w:r>
                   <w:rPr>
@@ -932,7 +670,7 @@
                 </w:r>
               </w:sdtContent>
             </w:sdt>
-            <w:permEnd w:id="926035648"/>
+            <w:permEnd w:id="1640057369"/>
           </w:p>
           <w:p>
             <w:pPr>
@@ -961,7 +699,7 @@
               </w:rPr>
               <w:tab/>
             </w:r>
-            <w:permStart w:id="1519068571" w:edGrp="everyone"/>
+            <w:permStart w:id="1311537899" w:edGrp="everyone"/>
             <w:sdt>
               <w:sdtPr>
                 <w:rPr>
@@ -975,7 +713,6 @@
                 <w15:appearance w15:val="hidden"/>
                 <w:text/>
               </w:sdtPr>
-              <w:sdtEndPr/>
               <w:sdtContent>
                 <w:r>
                   <w:rPr>
@@ -992,7 +729,7 @@
               </w:sdtContent>
             </w:sdt>
           </w:p>
-          <w:permEnd w:id="1519068571"/>
+          <w:permEnd w:id="1311537899"/>
           <w:p>
             <w:pPr>
               <w:pStyle w:val="Sinespaciado"/>
@@ -1020,7 +757,7 @@
               </w:rPr>
               <w:tab/>
             </w:r>
-            <w:permStart w:id="1983335098" w:edGrp="everyone"/>
+            <w:permStart w:id="458437268" w:edGrp="everyone"/>
             <w:sdt>
               <w:sdtPr>
                 <w:rPr>
@@ -1033,7 +770,6 @@
                 </w:placeholder>
                 <w:text/>
               </w:sdtPr>
-              <w:sdtEndPr/>
               <w:sdtContent>
                 <w:r>
                   <w:rPr>
@@ -1055,7 +791,7 @@
                 </w:r>
               </w:sdtContent>
             </w:sdt>
-            <w:permEnd w:id="1983335098"/>
+            <w:permEnd w:id="458437268"/>
           </w:p>
         </w:tc>
         <w:tc>
@@ -1069,260 +805,12 @@
             </w:tcMar>
           </w:tcPr>
           <w:p>
-            <w:r>
-              <w:t>Student #4</w:t>
-            </w:r>
-          </w:p>
-          <w:p>
-            <w:pPr>
-              <w:pStyle w:val="Sinespaciado"/>
-              <w:rPr>
-                <w:rFonts w:asciiTheme="majorHAnsi" w:hAnsiTheme="majorHAnsi" w:cstheme="majorHAnsi"/>
-                <w:b/>
-              </w:rPr>
-            </w:pPr>
-            <w:r>
-              <w:rPr>
-                <w:rFonts w:asciiTheme="majorHAnsi" w:hAnsiTheme="majorHAnsi" w:cstheme="majorHAnsi"/>
-                <w:b/>
-              </w:rPr>
-              <w:t>ID:</w:t>
-            </w:r>
-            <w:r>
-              <w:rPr>
-                <w:rFonts w:asciiTheme="majorHAnsi" w:hAnsiTheme="majorHAnsi" w:cstheme="majorHAnsi"/>
-                <w:b/>
-              </w:rPr>
-              <w:tab/>
-            </w:r>
-            <w:r>
-              <w:rPr>
-                <w:rFonts w:asciiTheme="majorHAnsi" w:hAnsiTheme="majorHAnsi" w:cstheme="majorHAnsi"/>
-              </w:rPr>
-              <w:tab/>
-            </w:r>
-            <w:permStart w:id="1222207409" w:edGrp="everyone"/>
-            <w:sdt>
-              <w:sdtPr>
-                <w:rPr>
-                  <w:rFonts w:asciiTheme="majorHAnsi" w:hAnsiTheme="majorHAnsi" w:cstheme="majorBidi"/>
-                </w:rPr>
-                <w:tag w:val="ID4"/>
-                <w:id w:val="577182649"/>
-                <w:placeholder>
-                  <w:docPart w:val="D9A40BD86CA043A99F41FFEC09CF32C5"/>
-                </w:placeholder>
-                <w15:appearance w15:val="hidden"/>
-                <w:text/>
-              </w:sdtPr>
-              <w:sdtEndPr/>
-              <w:sdtContent>
-                <w:r>
-                  <w:rPr>
-                    <w:rFonts w:asciiTheme="majorHAnsi" w:hAnsiTheme="majorHAnsi" w:cstheme="majorBidi"/>
-                  </w:rPr>
-                  <w:t xml:space="preserve"> </w:t>
-                </w:r>
-                <w:r>
-                  <w:rPr>
-                    <w:rFonts w:asciiTheme="majorHAnsi" w:hAnsiTheme="majorHAnsi" w:cstheme="majorBidi"/>
-                  </w:rPr>
-                  <w:t>4909****</w:t>
-                </w:r>
-              </w:sdtContent>
-            </w:sdt>
-          </w:p>
-          <w:permEnd w:id="1222207409"/>
-          <w:p>
-            <w:pPr>
-              <w:pStyle w:val="Sinespaciado"/>
-              <w:rPr>
-                <w:rFonts w:asciiTheme="majorHAnsi" w:hAnsiTheme="majorHAnsi" w:cstheme="majorHAnsi"/>
-                <w:b/>
-              </w:rPr>
-            </w:pPr>
-            <w:r>
-              <w:rPr>
-                <w:rFonts w:asciiTheme="majorHAnsi" w:hAnsiTheme="majorHAnsi" w:cstheme="majorHAnsi"/>
-                <w:b/>
-              </w:rPr>
-              <w:t xml:space="preserve">UVUS: </w:t>
-            </w:r>
-            <w:r>
-              <w:rPr>
-                <w:rFonts w:asciiTheme="majorHAnsi" w:hAnsiTheme="majorHAnsi" w:cstheme="majorHAnsi"/>
-                <w:b/>
-              </w:rPr>
-              <w:tab/>
-            </w:r>
-            <w:r>
-              <w:rPr>
-                <w:rFonts w:asciiTheme="majorHAnsi" w:hAnsiTheme="majorHAnsi" w:cstheme="majorHAnsi"/>
-                <w:b/>
-              </w:rPr>
-              <w:tab/>
-            </w:r>
-            <w:permStart w:id="484340907" w:edGrp="everyone"/>
-            <w:sdt>
-              <w:sdtPr>
-                <w:rPr>
-                  <w:rFonts w:asciiTheme="majorHAnsi" w:hAnsiTheme="majorHAnsi" w:cstheme="majorHAnsi"/>
-                </w:rPr>
-                <w:tag w:val="UVUS04"/>
-                <w:id w:val="-1772313792"/>
-                <w:placeholder>
-                  <w:docPart w:val="83AB65E9A82B4E5D8F27694A6CD354D0"/>
-                </w:placeholder>
-                <w15:appearance w15:val="hidden"/>
-                <w:text/>
-              </w:sdtPr>
-              <w:sdtEndPr/>
-              <w:sdtContent>
-                <w:r>
-                  <w:rPr>
-                    <w:rFonts w:asciiTheme="majorHAnsi" w:hAnsiTheme="majorHAnsi" w:cstheme="majorHAnsi"/>
-                  </w:rPr>
-                  <w:t xml:space="preserve"> </w:t>
-                </w:r>
-                <w:r>
-                  <w:rPr>
-                    <w:rFonts w:asciiTheme="majorHAnsi" w:hAnsiTheme="majorHAnsi" w:cstheme="majorHAnsi"/>
-                  </w:rPr>
-                  <w:t>YVT0703</w:t>
-                </w:r>
-              </w:sdtContent>
-            </w:sdt>
-            <w:permEnd w:id="484340907"/>
-          </w:p>
-          <w:p>
             <w:pPr>
               <w:pStyle w:val="Sinespaciado"/>
               <w:rPr>
                 <w:rFonts w:asciiTheme="majorHAnsi" w:hAnsiTheme="majorHAnsi" w:cstheme="majorHAnsi"/>
               </w:rPr>
             </w:pPr>
-            <w:r>
-              <w:rPr>
-                <w:rFonts w:asciiTheme="majorHAnsi" w:hAnsiTheme="majorHAnsi" w:cstheme="majorHAnsi"/>
-                <w:b/>
-              </w:rPr>
-              <w:t>Name:</w:t>
-            </w:r>
-            <w:r>
-              <w:rPr>
-                <w:rFonts w:asciiTheme="majorHAnsi" w:hAnsiTheme="majorHAnsi" w:cstheme="majorHAnsi"/>
-                <w:b/>
-              </w:rPr>
-              <w:tab/>
-            </w:r>
-            <w:r>
-              <w:rPr>
-                <w:rFonts w:asciiTheme="majorHAnsi" w:hAnsiTheme="majorHAnsi" w:cstheme="majorHAnsi"/>
-              </w:rPr>
-              <w:tab/>
-            </w:r>
-            <w:permStart w:id="386604040" w:edGrp="everyone"/>
-            <w:sdt>
-              <w:sdtPr>
-                <w:rPr>
-                  <w:rFonts w:asciiTheme="majorHAnsi" w:hAnsiTheme="majorHAnsi" w:cstheme="majorHAnsi"/>
-                </w:rPr>
-                <w:tag w:val="Student4"/>
-                <w:id w:val="-924030127"/>
-                <w:placeholder>
-                  <w:docPart w:val="3DB9FE5FE7F54E5B9E63A4AB2D2CB563"/>
-                </w:placeholder>
-                <w15:appearance w15:val="hidden"/>
-                <w:text/>
-              </w:sdtPr>
-              <w:sdtEndPr/>
-              <w:sdtContent>
-                <w:r>
-                  <w:rPr>
-                    <w:rFonts w:asciiTheme="majorHAnsi" w:hAnsiTheme="majorHAnsi" w:cstheme="majorHAnsi"/>
-                  </w:rPr>
-                  <w:t xml:space="preserve"> </w:t>
-                </w:r>
-                <w:r>
-                  <w:rPr>
-                    <w:rFonts w:asciiTheme="majorHAnsi" w:hAnsiTheme="majorHAnsi" w:cstheme="majorHAnsi"/>
-                  </w:rPr>
-                  <w:t>Ramírez Morales, Juan</w:t>
-                </w:r>
-                <w:r>
-                  <w:rPr>
-                    <w:rFonts w:asciiTheme="majorHAnsi" w:hAnsiTheme="majorHAnsi" w:cstheme="majorHAnsi"/>
-                  </w:rPr>
-                  <w:t xml:space="preserve">  </w:t>
-                </w:r>
-              </w:sdtContent>
-            </w:sdt>
-            <w:permEnd w:id="386604040"/>
-          </w:p>
-          <w:p>
-            <w:pPr>
-              <w:pStyle w:val="Sinespaciado"/>
-              <w:rPr>
-                <w:rFonts w:asciiTheme="majorHAnsi" w:hAnsiTheme="majorHAnsi" w:cstheme="majorHAnsi"/>
-              </w:rPr>
-            </w:pPr>
-            <w:r>
-              <w:rPr>
-                <w:rFonts w:asciiTheme="majorHAnsi" w:hAnsiTheme="majorHAnsi" w:cstheme="majorHAnsi"/>
-                <w:b/>
-              </w:rPr>
-              <w:t>Roles:</w:t>
-            </w:r>
-            <w:r>
-              <w:rPr>
-                <w:rFonts w:asciiTheme="majorHAnsi" w:hAnsiTheme="majorHAnsi" w:cstheme="majorHAnsi"/>
-                <w:b/>
-              </w:rPr>
-              <w:tab/>
-            </w:r>
-            <w:r>
-              <w:rPr>
-                <w:rFonts w:asciiTheme="majorHAnsi" w:hAnsiTheme="majorHAnsi" w:cstheme="majorHAnsi"/>
-              </w:rPr>
-              <w:tab/>
-            </w:r>
-            <w:permStart w:id="1487353257" w:edGrp="everyone"/>
-            <w:sdt>
-              <w:sdtPr>
-                <w:rPr>
-                  <w:rFonts w:asciiTheme="majorHAnsi" w:hAnsiTheme="majorHAnsi" w:cstheme="majorHAnsi"/>
-                </w:rPr>
-                <w:tag w:val="Roles4"/>
-                <w:id w:val="1414657434"/>
-                <w:placeholder>
-                  <w:docPart w:val="3DB9FE5FE7F54E5B9E63A4AB2D2CB563"/>
-                </w:placeholder>
-                <w15:appearance w15:val="hidden"/>
-                <w:text/>
-              </w:sdtPr>
-              <w:sdtEndPr/>
-              <w:sdtContent>
-                <w:r>
-                  <w:rPr>
-                    <w:rFonts w:asciiTheme="majorHAnsi" w:hAnsiTheme="majorHAnsi" w:cstheme="majorHAnsi"/>
-                  </w:rPr>
-                  <w:t xml:space="preserve"> </w:t>
-                </w:r>
-                <w:r>
-                  <w:rPr>
-                    <w:rFonts w:asciiTheme="majorHAnsi" w:hAnsiTheme="majorHAnsi" w:cstheme="majorHAnsi"/>
-                  </w:rPr>
-                  <w:t>Operator, developer, tester</w:t>
-                </w:r>
-                <w:r>
-                  <w:rPr>
-                    <w:rFonts w:asciiTheme="majorHAnsi" w:hAnsiTheme="majorHAnsi" w:cstheme="majorHAnsi"/>
-                  </w:rPr>
-                  <w:t xml:space="preserve">  </w:t>
-                </w:r>
-              </w:sdtContent>
-            </w:sdt>
-            <w:permEnd w:id="1487353257"/>
           </w:p>
         </w:tc>
       </w:tr>
@@ -1370,7 +858,7 @@
               </w:rPr>
               <w:tab/>
             </w:r>
-            <w:permStart w:id="1631927432" w:edGrp="everyone"/>
+            <w:permStart w:id="797736735" w:edGrp="everyone"/>
             <w:sdt>
               <w:sdtPr>
                 <w:rPr>
@@ -1384,7 +872,6 @@
                 <w15:appearance w15:val="hidden"/>
                 <w:text/>
               </w:sdtPr>
-              <w:sdtEndPr/>
               <w:sdtContent>
                 <w:r>
                   <w:rPr>
@@ -1401,7 +888,7 @@
               </w:sdtContent>
             </w:sdt>
           </w:p>
-          <w:permEnd w:id="1631927432"/>
+          <w:permEnd w:id="797736735"/>
           <w:p>
             <w:pPr>
               <w:pStyle w:val="Sinespaciado"/>
@@ -1431,7 +918,7 @@
               </w:rPr>
               <w:tab/>
             </w:r>
-            <w:permStart w:id="1398370153" w:edGrp="everyone"/>
+            <w:permStart w:id="138366337" w:edGrp="everyone"/>
             <w:sdt>
               <w:sdtPr>
                 <w:rPr>
@@ -1445,7 +932,6 @@
                 <w15:appearance w15:val="hidden"/>
                 <w:text/>
               </w:sdtPr>
-              <w:sdtEndPr/>
               <w:sdtContent>
                 <w:r>
                   <w:rPr>
@@ -1467,7 +953,7 @@
                 </w:r>
               </w:sdtContent>
             </w:sdt>
-            <w:permEnd w:id="1398370153"/>
+            <w:permEnd w:id="138366337"/>
           </w:p>
           <w:p>
             <w:pPr>
@@ -1496,7 +982,7 @@
               </w:rPr>
               <w:tab/>
             </w:r>
-            <w:permStart w:id="72570348" w:edGrp="everyone"/>
+            <w:permStart w:id="53479974" w:edGrp="everyone"/>
             <w:sdt>
               <w:sdtPr>
                 <w:rPr>
@@ -1510,7 +996,6 @@
                 <w15:appearance w15:val="hidden"/>
                 <w:text/>
               </w:sdtPr>
-              <w:sdtEndPr/>
               <w:sdtContent>
                 <w:r>
                   <w:rPr>
@@ -1540,7 +1025,7 @@
                 </w:r>
               </w:sdtContent>
             </w:sdt>
-            <w:permEnd w:id="72570348"/>
+            <w:permEnd w:id="53479974"/>
           </w:p>
           <w:p>
             <w:pPr>
@@ -1569,7 +1054,7 @@
               </w:rPr>
               <w:tab/>
             </w:r>
-            <w:permStart w:id="2077499526" w:edGrp="everyone"/>
+            <w:permStart w:id="814876543" w:edGrp="everyone"/>
             <w:sdt>
               <w:sdtPr>
                 <w:rPr>
@@ -1582,7 +1067,6 @@
                 </w:placeholder>
                 <w:text/>
               </w:sdtPr>
-              <w:sdtEndPr/>
               <w:sdtContent>
                 <w:r>
                   <w:rPr>
@@ -1604,7 +1088,7 @@
                 </w:r>
               </w:sdtContent>
             </w:sdt>
-            <w:permEnd w:id="2077499526"/>
+            <w:permEnd w:id="814876543"/>
           </w:p>
         </w:tc>
         <w:tc>
@@ -1666,7 +1150,7 @@
               </w:rPr>
               <w:tab/>
             </w:r>
-            <w:permStart w:id="1772436159" w:edGrp="everyone"/>
+            <w:permStart w:id="308288824" w:edGrp="everyone"/>
             <w:sdt>
               <w:sdtPr>
                 <w:rPr>
@@ -1680,7 +1164,6 @@
                 <w15:appearance w15:val="hidden"/>
                 <w:text/>
               </w:sdtPr>
-              <w:sdtEndPr/>
               <w:sdtContent>
                 <w:r>
                   <w:rPr>
@@ -1702,7 +1185,7 @@
                 </w:r>
               </w:sdtContent>
             </w:sdt>
-            <w:permEnd w:id="1772436159"/>
+            <w:permEnd w:id="308288824"/>
           </w:p>
         </w:tc>
       </w:tr>
@@ -1911,7 +1394,7 @@
       </w:r>
     </w:p>
     <w:bookmarkStart w:id="2" w:name="_Hlk157672140"/>
-    <w:permStart w:id="514992324" w:edGrp="everyone"/>
+    <w:permStart w:id="960173268" w:edGrp="everyone"/>
     <w:p>
       <w:pPr>
         <w:pStyle w:val="Comment-Grader"/>
@@ -1926,7 +1409,6 @@
           <w15:appearance w15:val="hidden"/>
           <w:text/>
         </w:sdtPr>
-        <w:sdtEndPr/>
         <w:sdtContent>
           <w:r>
             <w:t xml:space="preserve">  </w:t>
@@ -1939,7 +1421,7 @@
           </w:r>
         </w:sdtContent>
       </w:sdt>
-      <w:permEnd w:id="514992324"/>
+      <w:permEnd w:id="960173268"/>
       <w:r>
         <w:t xml:space="preserve">   </w:t>
       </w:r>
@@ -1954,7 +1436,7 @@
       </w:r>
     </w:p>
     <w:bookmarkStart w:id="3" w:name="_Hlk157672153"/>
-    <w:permStart w:id="1330789551" w:edGrp="everyone"/>
+    <w:permStart w:id="212422207" w:edGrp="everyone"/>
     <w:p>
       <w:pPr>
         <w:pStyle w:val="Comment-Grader"/>
@@ -1969,7 +1451,6 @@
           <w15:appearance w15:val="hidden"/>
           <w:text/>
         </w:sdtPr>
-        <w:sdtEndPr/>
         <w:sdtContent>
           <w:r>
             <w:t xml:space="preserve">  </w:t>
@@ -1982,7 +1463,7 @@
           </w:r>
         </w:sdtContent>
       </w:sdt>
-      <w:permEnd w:id="1330789551"/>
+      <w:permEnd w:id="212422207"/>
       <w:r>
         <w:t xml:space="preserve">  </w:t>
       </w:r>
@@ -2011,15 +1492,7 @@
         <w:t xml:space="preserve">, </w:t>
       </w:r>
       <w:r>
-        <w:t xml:space="preserve">their </w:t>
-      </w:r>
-      <w:bookmarkStart w:id="4" w:name="_Int_4q4WObMb"/>
-      <w:r>
-        <w:t>current status</w:t>
-      </w:r>
-      <w:bookmarkEnd w:id="4"/>
-      <w:r>
-        <w:t xml:space="preserve">, </w:t>
+        <w:t xml:space="preserve">their current status, </w:t>
       </w:r>
       <w:r>
         <w:t xml:space="preserve">and </w:t>
@@ -2031,7 +1504,7 @@
         <w:t>schedule.</w:t>
       </w:r>
     </w:p>
-    <w:permStart w:id="263077281" w:edGrp="everyone"/>
+    <w:permStart w:id="653218351" w:edGrp="everyone"/>
     <w:p>
       <w:pPr>
         <w:pStyle w:val="Comment-Grader"/>
@@ -2046,7 +1519,6 @@
           <w15:appearance w15:val="hidden"/>
           <w:text/>
         </w:sdtPr>
-        <w:sdtEndPr/>
         <w:sdtContent>
           <w:r>
             <w:t xml:space="preserve">  </w:t>
@@ -2059,7 +1531,7 @@
           </w:r>
         </w:sdtContent>
       </w:sdt>
-      <w:permEnd w:id="263077281"/>
+      <w:permEnd w:id="653218351"/>
       <w:r>
         <w:t xml:space="preserve">   </w:t>
       </w:r>
@@ -2248,8 +1720,8 @@
         </w:rPr>
         <w:t xml:space="preserve">contact phone number </w:t>
       </w:r>
-      <w:bookmarkStart w:id="5" w:name="OLE_LINK1"/>
-      <w:bookmarkStart w:id="6" w:name="OLE_LINK2"/>
+      <w:bookmarkStart w:id="4" w:name="OLE_LINK1"/>
+      <w:bookmarkStart w:id="5" w:name="OLE_LINK2"/>
       <w:r>
         <w:t>(pattern " ^\+?\d{</w:t>
       </w:r>
@@ -2259,8 +1731,8 @@
       <w:r>
         <w:t>,15}$")</w:t>
       </w:r>
+      <w:bookmarkEnd w:id="4"/>
       <w:bookmarkEnd w:id="5"/>
-      <w:bookmarkEnd w:id="6"/>
       <w:r>
         <w:t xml:space="preserve">.  </w:t>
       </w:r>
@@ -2274,7 +1746,7 @@
         <w:t>; no further information about them is needed in the system.</w:t>
       </w:r>
     </w:p>
-    <w:permStart w:id="3886208" w:edGrp="everyone"/>
+    <w:permStart w:id="2037730084" w:edGrp="everyone"/>
     <w:p>
       <w:pPr>
         <w:pStyle w:val="Comment-Grader"/>
@@ -2289,7 +1761,6 @@
           <w15:appearance w15:val="hidden"/>
           <w:text/>
         </w:sdtPr>
-        <w:sdtEndPr/>
         <w:sdtContent>
           <w:r>
             <w:t xml:space="preserve">  </w:t>
@@ -2302,7 +1773,7 @@
           </w:r>
         </w:sdtContent>
       </w:sdt>
-      <w:permEnd w:id="3886208"/>
+      <w:permEnd w:id="2037730084"/>
       <w:r>
         <w:t xml:space="preserve">  </w:t>
       </w:r>
@@ -2453,7 +1924,7 @@
         <w:t>,15}$").</w:t>
       </w:r>
     </w:p>
-    <w:permStart w:id="568988877" w:edGrp="everyone"/>
+    <w:permStart w:id="1975012333" w:edGrp="everyone"/>
     <w:p>
       <w:pPr>
         <w:pStyle w:val="Comment-Grader"/>
@@ -2468,7 +1939,6 @@
           <w15:appearance w15:val="hidden"/>
           <w:text/>
         </w:sdtPr>
-        <w:sdtEndPr/>
         <w:sdtContent>
           <w:r>
             <w:t xml:space="preserve">  </w:t>
@@ -2481,7 +1951,7 @@
           </w:r>
         </w:sdtContent>
       </w:sdt>
-      <w:permEnd w:id="568988877"/>
+      <w:permEnd w:id="1975012333"/>
       <w:r>
         <w:t xml:space="preserve">   </w:t>
       </w:r>
@@ -2672,7 +2142,7 @@
         <w:t xml:space="preserve"> characters).</w:t>
       </w:r>
     </w:p>
-    <w:permStart w:id="64176652" w:edGrp="everyone"/>
+    <w:permStart w:id="1952077005" w:edGrp="everyone"/>
     <w:p>
       <w:pPr>
         <w:pStyle w:val="Comment-Grader"/>
@@ -2687,7 +2157,6 @@
           <w15:appearance w15:val="hidden"/>
           <w:text/>
         </w:sdtPr>
-        <w:sdtEndPr/>
         <w:sdtContent>
           <w:r>
             <w:t xml:space="preserve">  </w:t>
@@ -2700,7 +2169,7 @@
           </w:r>
         </w:sdtContent>
       </w:sdt>
-      <w:permEnd w:id="64176652"/>
+      <w:permEnd w:id="1952077005"/>
       <w:r>
         <w:t xml:space="preserve">      </w:t>
       </w:r>
@@ -2869,7 +2338,7 @@
         <w:t xml:space="preserve">. </w:t>
       </w:r>
     </w:p>
-    <w:permStart w:id="2084199269" w:edGrp="everyone"/>
+    <w:permStart w:id="520909001" w:edGrp="everyone"/>
     <w:p>
       <w:pPr>
         <w:pStyle w:val="Comment-Grader"/>
@@ -2884,7 +2353,6 @@
           <w15:appearance w15:val="hidden"/>
           <w:text/>
         </w:sdtPr>
-        <w:sdtEndPr/>
         <w:sdtContent>
           <w:r>
             <w:t xml:space="preserve">  </w:t>
@@ -2897,7 +2365,7 @@
           </w:r>
         </w:sdtContent>
       </w:sdt>
-      <w:permEnd w:id="2084199269"/>
+      <w:permEnd w:id="520909001"/>
       <w:r>
         <w:t xml:space="preserve">   </w:t>
       </w:r>
@@ -3113,7 +2581,7 @@
         <w:t xml:space="preserve"> or not. </w:t>
       </w:r>
     </w:p>
-    <w:permStart w:id="1789663349" w:edGrp="everyone"/>
+    <w:permStart w:id="1024669070" w:edGrp="everyone"/>
     <w:p>
       <w:pPr>
         <w:pStyle w:val="Comment-Grader"/>
@@ -3128,7 +2596,6 @@
           <w15:appearance w15:val="hidden"/>
           <w:text/>
         </w:sdtPr>
-        <w:sdtEndPr/>
         <w:sdtContent>
           <w:r>
             <w:t xml:space="preserve"> </w:t>
@@ -3141,7 +2608,7 @@
           </w:r>
         </w:sdtContent>
       </w:sdt>
-      <w:permEnd w:id="1789663349"/>
+      <w:permEnd w:id="1024669070"/>
       <w:r>
         <w:t xml:space="preserve">   </w:t>
       </w:r>
@@ -3248,7 +2715,7 @@
         <w:t>”.</w:t>
       </w:r>
     </w:p>
-    <w:permStart w:id="1472210995" w:edGrp="everyone"/>
+    <w:permStart w:id="940329759" w:edGrp="everyone"/>
     <w:p>
       <w:pPr>
         <w:pStyle w:val="Comment-Grader"/>
@@ -3263,7 +2730,6 @@
           <w15:appearance w15:val="hidden"/>
           <w:text/>
         </w:sdtPr>
-        <w:sdtEndPr/>
         <w:sdtContent>
           <w:r>
             <w:t xml:space="preserve">  </w:t>
@@ -3276,7 +2742,7 @@
           </w:r>
         </w:sdtContent>
       </w:sdt>
-      <w:permEnd w:id="1472210995"/>
+      <w:permEnd w:id="940329759"/>
       <w:r>
         <w:t xml:space="preserve">    </w:t>
       </w:r>
@@ -3327,7 +2793,7 @@
         <w:t>.</w:t>
       </w:r>
     </w:p>
-    <w:permStart w:id="1506941238" w:edGrp="everyone"/>
+    <w:permStart w:id="222523439" w:edGrp="everyone"/>
     <w:p>
       <w:pPr>
         <w:pStyle w:val="Comment-Grader"/>
@@ -3342,7 +2808,6 @@
           <w15:appearance w15:val="hidden"/>
           <w:text/>
         </w:sdtPr>
-        <w:sdtEndPr/>
         <w:sdtContent>
           <w:r>
             <w:t xml:space="preserve">  </w:t>
@@ -3355,7 +2820,7 @@
           </w:r>
         </w:sdtContent>
       </w:sdt>
-      <w:permEnd w:id="1506941238"/>
+      <w:permEnd w:id="222523439"/>
       <w:r>
         <w:t xml:space="preserve">    </w:t>
       </w:r>
@@ -3494,7 +2959,7 @@
         <w:t>require confirmation.</w:t>
       </w:r>
     </w:p>
-    <w:permStart w:id="877278202" w:edGrp="everyone"/>
+    <w:permStart w:id="1983741739" w:edGrp="everyone"/>
     <w:p>
       <w:pPr>
         <w:pStyle w:val="Comment-Grader"/>
@@ -3509,7 +2974,6 @@
           <w15:appearance w15:val="hidden"/>
           <w:text/>
         </w:sdtPr>
-        <w:sdtEndPr/>
         <w:sdtContent>
           <w:r>
             <w:t xml:space="preserve"> </w:t>
@@ -3522,7 +2986,7 @@
           </w:r>
         </w:sdtContent>
       </w:sdt>
-      <w:permEnd w:id="877278202"/>
+      <w:permEnd w:id="1983741739"/>
     </w:p>
     <w:p>
       <w:pPr>
@@ -3586,7 +3050,7 @@
         <w:t xml:space="preserve"> Both operations require confirmation.</w:t>
       </w:r>
     </w:p>
-    <w:permStart w:id="793719138" w:edGrp="everyone"/>
+    <w:permStart w:id="1359305475" w:edGrp="everyone"/>
     <w:p>
       <w:pPr>
         <w:pStyle w:val="Comment-Grader"/>
@@ -3601,7 +3065,6 @@
           <w15:appearance w15:val="hidden"/>
           <w:text/>
         </w:sdtPr>
-        <w:sdtEndPr/>
         <w:sdtContent>
           <w:r>
             <w:t xml:space="preserve">  </w:t>
@@ -3614,7 +3077,7 @@
           </w:r>
         </w:sdtContent>
       </w:sdt>
-      <w:permEnd w:id="793719138"/>
+      <w:permEnd w:id="1359305475"/>
       <w:r>
         <w:t xml:space="preserve">   </w:t>
       </w:r>
@@ -3678,7 +3141,7 @@
         <w:t>operations require confirmation.</w:t>
       </w:r>
     </w:p>
-    <w:permStart w:id="1433148399" w:edGrp="everyone"/>
+    <w:permStart w:id="2024236755" w:edGrp="everyone"/>
     <w:p>
       <w:pPr>
         <w:pStyle w:val="Comment-Grader"/>
@@ -3693,7 +3156,6 @@
           <w15:appearance w15:val="hidden"/>
           <w:text/>
         </w:sdtPr>
-        <w:sdtEndPr/>
         <w:sdtContent>
           <w:r>
             <w:t xml:space="preserve"> </w:t>
@@ -3706,7 +3168,7 @@
           </w:r>
         </w:sdtContent>
       </w:sdt>
-      <w:permEnd w:id="1433148399"/>
+      <w:permEnd w:id="2024236755"/>
       <w:r>
         <w:t xml:space="preserve">   </w:t>
       </w:r>
@@ -3759,7 +3221,7 @@
         <w:t>); the services must be promoted in every page as little intrusively as possible.</w:t>
       </w:r>
     </w:p>
-    <w:permStart w:id="1002920657" w:edGrp="everyone"/>
+    <w:permStart w:id="364344351" w:edGrp="everyone"/>
     <w:p>
       <w:pPr>
         <w:pStyle w:val="Comment-Grader"/>
@@ -3774,7 +3236,6 @@
           <w15:appearance w15:val="hidden"/>
           <w:text/>
         </w:sdtPr>
-        <w:sdtEndPr/>
         <w:sdtContent>
           <w:r>
             <w:t xml:space="preserve">  </w:t>
@@ -3787,7 +3248,7 @@
           </w:r>
         </w:sdtContent>
       </w:sdt>
-      <w:permEnd w:id="1002920657"/>
+      <w:permEnd w:id="364344351"/>
       <w:r>
         <w:t xml:space="preserve">   </w:t>
       </w:r>
@@ -3861,7 +3322,7 @@
         <w:t>Provide a link to your planning dashboard in GitHub to review the tasks, their current status, and your schedule.</w:t>
       </w:r>
     </w:p>
-    <w:permStart w:id="1902000534" w:edGrp="everyone"/>
+    <w:permStart w:id="1084897338" w:edGrp="everyone"/>
     <w:p>
       <w:pPr>
         <w:pStyle w:val="Comment-Grader"/>
@@ -3876,7 +3337,6 @@
           <w15:appearance w15:val="hidden"/>
           <w:text/>
         </w:sdtPr>
-        <w:sdtEndPr/>
         <w:sdtContent>
           <w:r>
             <w:t xml:space="preserve">  </w:t>
@@ -3889,7 +3349,7 @@
           </w:r>
         </w:sdtContent>
       </w:sdt>
-      <w:permEnd w:id="1902000534"/>
+      <w:permEnd w:id="1084897338"/>
       <w:r>
         <w:t xml:space="preserve">  </w:t>
       </w:r>
@@ -3952,7 +3412,7 @@
         <w:t xml:space="preserve">Create appropriate indexes for your entities, if required. </w:t>
       </w:r>
     </w:p>
-    <w:permStart w:id="47063208" w:edGrp="everyone"/>
+    <w:permStart w:id="2004747747" w:edGrp="everyone"/>
     <w:p>
       <w:pPr>
         <w:pStyle w:val="Comment-Grader"/>
@@ -3967,7 +3427,6 @@
           <w15:appearance w15:val="hidden"/>
           <w:text/>
         </w:sdtPr>
-        <w:sdtEndPr/>
         <w:sdtContent>
           <w:r>
             <w:t xml:space="preserve">  </w:t>
@@ -3980,7 +3439,7 @@
           </w:r>
         </w:sdtContent>
       </w:sdt>
-      <w:permEnd w:id="47063208"/>
+      <w:permEnd w:id="2004747747"/>
       <w:r>
         <w:t xml:space="preserve">   </w:t>
       </w:r>
@@ -4054,7 +3513,7 @@
         <w:t>.</w:t>
       </w:r>
     </w:p>
-    <w:permStart w:id="759059702" w:edGrp="everyone"/>
+    <w:permStart w:id="511801055" w:edGrp="everyone"/>
     <w:p>
       <w:pPr>
         <w:pStyle w:val="Comment-Grader"/>
@@ -4069,7 +3528,6 @@
           <w15:appearance w15:val="hidden"/>
           <w:text/>
         </w:sdtPr>
-        <w:sdtEndPr/>
         <w:sdtContent>
           <w:r>
             <w:t xml:space="preserve">  </w:t>
@@ -4082,7 +3540,7 @@
           </w:r>
         </w:sdtContent>
       </w:sdt>
-      <w:permEnd w:id="759059702"/>
+      <w:permEnd w:id="511801055"/>
       <w:r>
         <w:t xml:space="preserve">  </w:t>
       </w:r>
@@ -4112,7 +3570,7 @@
         <w:t xml:space="preserve">  </w:t>
       </w:r>
     </w:p>
-    <w:permStart w:id="1340033691" w:edGrp="everyone"/>
+    <w:permStart w:id="75725101" w:edGrp="everyone"/>
     <w:p>
       <w:pPr>
         <w:pStyle w:val="Comment-Grader"/>
@@ -4127,7 +3585,6 @@
           <w15:appearance w15:val="hidden"/>
           <w:text/>
         </w:sdtPr>
-        <w:sdtEndPr/>
         <w:sdtContent>
           <w:r>
             <w:t xml:space="preserve">  </w:t>
@@ -4140,7 +3597,7 @@
           </w:r>
         </w:sdtContent>
       </w:sdt>
-      <w:permEnd w:id="1340033691"/>
+      <w:permEnd w:id="75725101"/>
       <w:r>
         <w:t xml:space="preserve">   </w:t>
       </w:r>
@@ -4153,7 +3610,7 @@
         <w:t xml:space="preserve">Produce a testing report. </w:t>
       </w:r>
     </w:p>
-    <w:permStart w:id="867524682" w:edGrp="everyone"/>
+    <w:permStart w:id="432682287" w:edGrp="everyone"/>
     <w:p>
       <w:pPr>
         <w:pStyle w:val="Comment-Grader"/>
@@ -4168,7 +3625,6 @@
           <w15:appearance w15:val="hidden"/>
           <w:text/>
         </w:sdtPr>
-        <w:sdtEndPr/>
         <w:sdtContent>
           <w:r>
             <w:t xml:space="preserve"> </w:t>
@@ -4181,7 +3637,7 @@
           </w:r>
         </w:sdtContent>
       </w:sdt>
-      <w:permEnd w:id="867524682"/>
+      <w:permEnd w:id="432682287"/>
       <w:r>
         <w:t xml:space="preserve">   </w:t>
       </w:r>
@@ -4332,7 +3788,7 @@
         <w:t>.</w:t>
       </w:r>
     </w:p>
-    <w:permStart w:id="322599070" w:edGrp="everyone"/>
+    <w:permStart w:id="372120531" w:edGrp="everyone"/>
     <w:p>
       <w:pPr>
         <w:pStyle w:val="Comment-Grader"/>
@@ -4347,7 +3803,6 @@
           <w15:appearance w15:val="hidden"/>
           <w:text/>
         </w:sdtPr>
-        <w:sdtEndPr/>
         <w:sdtContent>
           <w:r>
             <w:t xml:space="preserve"> </w:t>
@@ -4360,7 +3815,7 @@
           </w:r>
         </w:sdtContent>
       </w:sdt>
-      <w:permEnd w:id="322599070"/>
+      <w:permEnd w:id="372120531"/>
       <w:r>
         <w:t xml:space="preserve">      </w:t>
       </w:r>
@@ -4412,7 +3867,7 @@
         <w:t>Produce a report on what you knew about the architecture of a WIS before this subject. </w:t>
       </w:r>
     </w:p>
-    <w:permStart w:id="1262108067" w:edGrp="everyone"/>
+    <w:permStart w:id="1755387810" w:edGrp="everyone"/>
     <w:p>
       <w:pPr>
         <w:pStyle w:val="Comment-Grader"/>
@@ -4427,14 +3882,13 @@
           <w15:appearance w15:val="hidden"/>
           <w:text/>
         </w:sdtPr>
-        <w:sdtEndPr/>
         <w:sdtContent>
           <w:r>
             <w:t xml:space="preserve">    </w:t>
           </w:r>
         </w:sdtContent>
       </w:sdt>
-      <w:permEnd w:id="1262108067"/>
+      <w:permEnd w:id="1755387810"/>
       <w:r>
         <w:t xml:space="preserve">   </w:t>
       </w:r>
@@ -4447,7 +3901,7 @@
         <w:t>Produce a report on what you knew about testing a WIS before this subject. </w:t>
       </w:r>
     </w:p>
-    <w:permStart w:id="2072198547" w:edGrp="everyone"/>
+    <w:permStart w:id="1085613373" w:edGrp="everyone"/>
     <w:p>
       <w:pPr>
         <w:pStyle w:val="Comment-Grader"/>
@@ -4462,14 +3916,13 @@
           <w15:appearance w15:val="hidden"/>
           <w:text/>
         </w:sdtPr>
-        <w:sdtEndPr/>
         <w:sdtContent>
           <w:r>
             <w:t xml:space="preserve">    </w:t>
           </w:r>
         </w:sdtContent>
       </w:sdt>
-      <w:permEnd w:id="2072198547"/>
+      <w:permEnd w:id="1085613373"/>
       <w:r>
         <w:t xml:space="preserve">  </w:t>
       </w:r>
@@ -4497,7 +3950,7 @@
         <w:t>, and you have your development configuration ready to work.</w:t>
       </w:r>
     </w:p>
-    <w:permStart w:id="893265149" w:edGrp="everyone"/>
+    <w:permStart w:id="595926935" w:edGrp="everyone"/>
     <w:p>
       <w:pPr>
         <w:pStyle w:val="Comment-Grader"/>
@@ -4512,7 +3965,6 @@
           <w15:appearance w15:val="hidden"/>
           <w:text/>
         </w:sdtPr>
-        <w:sdtEndPr/>
         <w:sdtContent>
           <w:r>
             <w:t xml:space="preserve">  </w:t>
@@ -4525,7 +3977,7 @@
           </w:r>
         </w:sdtContent>
       </w:sdt>
-      <w:permEnd w:id="893265149"/>
+      <w:permEnd w:id="595926935"/>
       <w:r>
         <w:t xml:space="preserve">   </w:t>
       </w:r>
@@ -4618,7 +4070,7 @@
         <w:t>, which must be initialised to “EUR”, “USD”, and “GBP”. </w:t>
       </w:r>
     </w:p>
-    <w:permStart w:id="1208632185" w:edGrp="everyone"/>
+    <w:permStart w:id="1722642685" w:edGrp="everyone"/>
     <w:p>
       <w:pPr>
         <w:pStyle w:val="Comment-Grader"/>
@@ -4633,14 +4085,13 @@
           <w15:appearance w15:val="hidden"/>
           <w:text/>
         </w:sdtPr>
-        <w:sdtEndPr/>
         <w:sdtContent>
           <w:r>
             <w:t xml:space="preserve">    </w:t>
           </w:r>
         </w:sdtContent>
       </w:sdt>
-      <w:permEnd w:id="1208632185"/>
+      <w:permEnd w:id="1722642685"/>
       <w:r>
         <w:t xml:space="preserve">     </w:t>
       </w:r>
@@ -4755,7 +4206,7 @@
         <w:t>verage, minimum, maximum, and standard deviation of the number of reviews posted over the last 10 weeks.</w:t>
       </w:r>
     </w:p>
-    <w:permStart w:id="230453759" w:edGrp="everyone"/>
+    <w:permStart w:id="71390633" w:edGrp="everyone"/>
     <w:p>
       <w:pPr>
         <w:pStyle w:val="Comment-Grader"/>
@@ -4770,14 +4221,13 @@
           <w15:appearance w15:val="hidden"/>
           <w:text/>
         </w:sdtPr>
-        <w:sdtEndPr/>
         <w:sdtContent>
           <w:r>
             <w:t xml:space="preserve">    </w:t>
           </w:r>
         </w:sdtContent>
       </w:sdt>
-      <w:permEnd w:id="230453759"/>
+      <w:permEnd w:id="71390633"/>
       <w:r>
         <w:t xml:space="preserve">   </w:t>
       </w:r>
@@ -4885,7 +4335,7 @@
         <w:t>. </w:t>
       </w:r>
     </w:p>
-    <w:permStart w:id="732176783" w:edGrp="everyone"/>
+    <w:permStart w:id="1571051714" w:edGrp="everyone"/>
     <w:p>
       <w:pPr>
         <w:pStyle w:val="Comment-Grader"/>
@@ -4900,7 +4350,6 @@
           <w15:appearance w15:val="hidden"/>
           <w:text/>
         </w:sdtPr>
-        <w:sdtEndPr/>
         <w:sdtContent>
           <w:r>
             <w:t xml:space="preserve"> </w:t>
@@ -4913,7 +4362,7 @@
           </w:r>
         </w:sdtContent>
       </w:sdt>
-      <w:permEnd w:id="732176783"/>
+      <w:permEnd w:id="1571051714"/>
       <w:r>
         <w:t xml:space="preserve">    </w:t>
       </w:r>
@@ -5046,7 +4495,7 @@
         <w:t>the services.</w:t>
       </w:r>
     </w:p>
-    <w:permStart w:id="1985440427" w:edGrp="everyone"/>
+    <w:permStart w:id="1870346029" w:edGrp="everyone"/>
     <w:p>
       <w:pPr>
         <w:pStyle w:val="Comment-Grader"/>
@@ -5061,14 +4510,13 @@
           <w15:appearance w15:val="hidden"/>
           <w:text/>
         </w:sdtPr>
-        <w:sdtEndPr/>
         <w:sdtContent>
           <w:r>
             <w:t xml:space="preserve">    </w:t>
           </w:r>
         </w:sdtContent>
       </w:sdt>
-      <w:permEnd w:id="1985440427"/>
+      <w:permEnd w:id="1870346029"/>
       <w:r>
         <w:t xml:space="preserve">   </w:t>
       </w:r>
@@ -5146,7 +4594,7 @@
         <w:t>This operation requires a confirmation since reviews cannot be updated or deleted.</w:t>
       </w:r>
     </w:p>
-    <w:permStart w:id="1070278833" w:edGrp="everyone"/>
+    <w:permStart w:id="1857453914" w:edGrp="everyone"/>
     <w:p>
       <w:pPr>
         <w:pStyle w:val="Comment-Grader"/>
@@ -5161,14 +4609,13 @@
           <w15:appearance w15:val="hidden"/>
           <w:text/>
         </w:sdtPr>
-        <w:sdtEndPr/>
         <w:sdtContent>
           <w:r>
             <w:t xml:space="preserve">    </w:t>
           </w:r>
         </w:sdtContent>
       </w:sdt>
-      <w:permEnd w:id="1070278833"/>
+      <w:permEnd w:id="1857453914"/>
       <w:r>
         <w:t xml:space="preserve">   </w:t>
       </w:r>
@@ -5223,7 +4670,7 @@
         <w:t>Update the system configuration. </w:t>
       </w:r>
     </w:p>
-    <w:permStart w:id="1694506261" w:edGrp="everyone"/>
+    <w:permStart w:id="21825355" w:edGrp="everyone"/>
     <w:p>
       <w:pPr>
         <w:pStyle w:val="Comment-Grader"/>
@@ -5238,14 +4685,13 @@
           <w15:appearance w15:val="hidden"/>
           <w:text/>
         </w:sdtPr>
-        <w:sdtEndPr/>
         <w:sdtContent>
           <w:r>
             <w:t xml:space="preserve">    </w:t>
           </w:r>
         </w:sdtContent>
       </w:sdt>
-      <w:permEnd w:id="1694506261"/>
+      <w:permEnd w:id="21825355"/>
       <w:r>
         <w:t xml:space="preserve">   </w:t>
       </w:r>
@@ -5303,7 +4749,7 @@
         <w:t xml:space="preserve">. </w:t>
       </w:r>
     </w:p>
-    <w:permStart w:id="2084703222" w:edGrp="everyone"/>
+    <w:permStart w:id="1302208211" w:edGrp="everyone"/>
     <w:p>
       <w:pPr>
         <w:pStyle w:val="Comment-Grader"/>
@@ -5318,14 +4764,13 @@
           <w15:appearance w15:val="hidden"/>
           <w:text/>
         </w:sdtPr>
-        <w:sdtEndPr/>
         <w:sdtContent>
           <w:r>
             <w:t xml:space="preserve">    </w:t>
           </w:r>
         </w:sdtContent>
       </w:sdt>
-      <w:permEnd w:id="2084703222"/>
+      <w:permEnd w:id="1302208211"/>
       <w:r>
         <w:t xml:space="preserve">   </w:t>
       </w:r>
@@ -5375,7 +4820,7 @@
         <w:t>. </w:t>
       </w:r>
     </w:p>
-    <w:permStart w:id="2120495563" w:edGrp="everyone"/>
+    <w:permStart w:id="1075993270" w:edGrp="everyone"/>
     <w:p>
       <w:pPr>
         <w:pStyle w:val="Comment-Grader"/>
@@ -5390,23 +4835,22 @@
           <w15:appearance w15:val="hidden"/>
           <w:text/>
         </w:sdtPr>
-        <w:sdtEndPr/>
         <w:sdtContent>
           <w:r>
             <w:t xml:space="preserve">    </w:t>
           </w:r>
         </w:sdtContent>
       </w:sdt>
-      <w:permEnd w:id="2120495563"/>
+      <w:permEnd w:id="1075993270"/>
       <w:r>
         <w:t xml:space="preserve">   </w:t>
       </w:r>
-      <w:bookmarkStart w:id="7" w:name="_Hlk157672549"/>
+      <w:bookmarkStart w:id="6" w:name="_Hlk157672549"/>
       <w:r>
         <w:t xml:space="preserve">  </w:t>
       </w:r>
     </w:p>
-    <w:bookmarkEnd w:id="7"/>
+    <w:bookmarkEnd w:id="6"/>
     <w:p>
       <w:pPr>
         <w:pStyle w:val="Ttulo2"/>
@@ -5460,7 +4904,7 @@
         <w:t xml:space="preserve">. </w:t>
       </w:r>
     </w:p>
-    <w:permStart w:id="422514435" w:edGrp="everyone"/>
+    <w:permStart w:id="1791297325" w:edGrp="everyone"/>
     <w:p>
       <w:pPr>
         <w:pStyle w:val="Comment-Grader"/>
@@ -5475,14 +4919,13 @@
           <w15:appearance w15:val="hidden"/>
           <w:text/>
         </w:sdtPr>
-        <w:sdtEndPr/>
         <w:sdtContent>
           <w:r>
             <w:t xml:space="preserve">    </w:t>
           </w:r>
         </w:sdtContent>
       </w:sdt>
-      <w:permEnd w:id="422514435"/>
+      <w:permEnd w:id="1791297325"/>
     </w:p>
     <w:p>
       <w:pPr>
@@ -5555,7 +4998,7 @@
         <w:t>.</w:t>
       </w:r>
     </w:p>
-    <w:permStart w:id="433923951" w:edGrp="everyone"/>
+    <w:permStart w:id="787628737" w:edGrp="everyone"/>
     <w:p>
       <w:pPr>
         <w:pStyle w:val="Comment-Grader"/>
@@ -5570,14 +5013,13 @@
           <w15:appearance w15:val="hidden"/>
           <w:text/>
         </w:sdtPr>
-        <w:sdtEndPr/>
         <w:sdtContent>
           <w:r>
             <w:t xml:space="preserve">    </w:t>
           </w:r>
         </w:sdtContent>
       </w:sdt>
-      <w:permEnd w:id="433923951"/>
+      <w:permEnd w:id="787628737"/>
       <w:r>
         <w:t xml:space="preserve">     </w:t>
       </w:r>
@@ -5712,7 +5154,7 @@
         <w:t>report on the results.</w:t>
       </w:r>
     </w:p>
-    <w:permStart w:id="1465547332" w:edGrp="everyone"/>
+    <w:permStart w:id="887307482" w:edGrp="everyone"/>
     <w:p>
       <w:pPr>
         <w:pStyle w:val="Comment-Grader"/>
@@ -5727,14 +5169,13 @@
           <w15:appearance w15:val="hidden"/>
           <w:text/>
         </w:sdtPr>
-        <w:sdtEndPr/>
         <w:sdtContent>
           <w:r>
             <w:t xml:space="preserve">    </w:t>
           </w:r>
         </w:sdtContent>
       </w:sdt>
-      <w:permEnd w:id="1465547332"/>
+      <w:permEnd w:id="887307482"/>
       <w:r>
         <w:t xml:space="preserve">  </w:t>
       </w:r>
@@ -5761,7 +5202,7 @@
         <w:t>Produce a lint report.</w:t>
       </w:r>
     </w:p>
-    <w:permStart w:id="2056024124" w:edGrp="everyone"/>
+    <w:permStart w:id="2026124554" w:edGrp="everyone"/>
     <w:p>
       <w:pPr>
         <w:pStyle w:val="Comment-Grader"/>
@@ -5776,14 +5217,13 @@
           <w15:appearance w15:val="hidden"/>
           <w:text/>
         </w:sdtPr>
-        <w:sdtEndPr/>
         <w:sdtContent>
           <w:r>
             <w:t xml:space="preserve">    </w:t>
           </w:r>
         </w:sdtContent>
       </w:sdt>
-      <w:permEnd w:id="2056024124"/>
+      <w:permEnd w:id="2026124554"/>
       <w:r>
         <w:t xml:space="preserve">          </w:t>
       </w:r>
@@ -5951,7 +5391,7 @@
         <w:t>Produce an analysis report.</w:t>
       </w:r>
     </w:p>
-    <w:permStart w:id="358632476" w:edGrp="everyone"/>
+    <w:permStart w:id="890782365" w:edGrp="everyone"/>
     <w:p>
       <w:pPr>
         <w:pStyle w:val="Comment-Grader"/>
@@ -5966,14 +5406,13 @@
           <w15:appearance w15:val="hidden"/>
           <w:text/>
         </w:sdtPr>
-        <w:sdtEndPr/>
         <w:sdtContent>
           <w:r>
             <w:t xml:space="preserve">    </w:t>
           </w:r>
         </w:sdtContent>
       </w:sdt>
-      <w:permEnd w:id="358632476"/>
+      <w:permEnd w:id="890782365"/>
       <w:r>
         <w:t xml:space="preserve">   </w:t>
       </w:r>
@@ -5986,7 +5425,7 @@
         <w:t>Produce a planning and progress report.</w:t>
       </w:r>
     </w:p>
-    <w:permStart w:id="1731732844" w:edGrp="everyone"/>
+    <w:permStart w:id="2083326338" w:edGrp="everyone"/>
     <w:p>
       <w:pPr>
         <w:pStyle w:val="Comment-Grader"/>
@@ -6001,14 +5440,13 @@
           <w15:appearance w15:val="hidden"/>
           <w:text/>
         </w:sdtPr>
-        <w:sdtEndPr/>
         <w:sdtContent>
           <w:r>
             <w:t xml:space="preserve">    </w:t>
           </w:r>
         </w:sdtContent>
       </w:sdt>
-      <w:permEnd w:id="1731732844"/>
+      <w:permEnd w:id="2083326338"/>
       <w:r>
         <w:t xml:space="preserve">   </w:t>
       </w:r>
@@ -6223,7 +5661,7 @@
         <w:t xml:space="preserve"> (in the past) to indicate whether the passenger is still banned or if the prohibition has been lifted. </w:t>
       </w:r>
     </w:p>
-    <w:permStart w:id="1815554783" w:edGrp="everyone"/>
+    <w:permStart w:id="952376566" w:edGrp="everyone"/>
     <w:p>
       <w:pPr>
         <w:pStyle w:val="Comment-Grader"/>
@@ -6238,14 +5676,13 @@
           <w15:appearance w15:val="hidden"/>
           <w:text/>
         </w:sdtPr>
-        <w:sdtEndPr/>
         <w:sdtContent>
           <w:r>
             <w:t xml:space="preserve">    </w:t>
           </w:r>
         </w:sdtContent>
       </w:sdt>
-      <w:permEnd w:id="1815554783"/>
+      <w:permEnd w:id="952376566"/>
       <w:r>
         <w:t xml:space="preserve"> </w:t>
       </w:r>
@@ -6313,7 +5750,7 @@
         <w:t>pay-per-use services!  This requirement must be fulfilled in this and every other group or individual deliverable for it to be considered satisfied. </w:t>
       </w:r>
     </w:p>
-    <w:permStart w:id="1408045569" w:edGrp="everyone"/>
+    <w:permStart w:id="159606273" w:edGrp="everyone"/>
     <w:p>
       <w:pPr>
         <w:pStyle w:val="Comment-Grader"/>
@@ -6328,14 +5765,13 @@
           <w15:appearance w15:val="hidden"/>
           <w:text/>
         </w:sdtPr>
-        <w:sdtEndPr/>
         <w:sdtContent>
           <w:r>
             <w:t xml:space="preserve">    </w:t>
           </w:r>
         </w:sdtContent>
       </w:sdt>
-      <w:permEnd w:id="1408045569"/>
+      <w:permEnd w:id="159606273"/>
       <w:r>
         <w:t xml:space="preserve">  </w:t>
       </w:r>
@@ -6390,7 +5826,7 @@
         <w:t>Produce an analysis report.</w:t>
       </w:r>
     </w:p>
-    <w:permStart w:id="1362912911" w:edGrp="everyone"/>
+    <w:permStart w:id="411374720" w:edGrp="everyone"/>
     <w:p>
       <w:pPr>
         <w:pStyle w:val="Comment-Grader"/>
@@ -6405,14 +5841,13 @@
           <w15:appearance w15:val="hidden"/>
           <w:text/>
         </w:sdtPr>
-        <w:sdtEndPr/>
         <w:sdtContent>
           <w:r>
             <w:t xml:space="preserve">    </w:t>
           </w:r>
         </w:sdtContent>
       </w:sdt>
-      <w:permEnd w:id="1362912911"/>
+      <w:permEnd w:id="411374720"/>
       <w:r>
         <w:t xml:space="preserve">   </w:t>
       </w:r>
@@ -6425,7 +5860,7 @@
         <w:t>Produce a planning and progress report.</w:t>
       </w:r>
     </w:p>
-    <w:permStart w:id="2031892606" w:edGrp="everyone"/>
+    <w:permStart w:id="2044158838" w:edGrp="everyone"/>
     <w:p>
       <w:pPr>
         <w:pStyle w:val="Comment-Grader"/>
@@ -6440,14 +5875,13 @@
           <w15:appearance w15:val="hidden"/>
           <w:text/>
         </w:sdtPr>
-        <w:sdtEndPr/>
         <w:sdtContent>
           <w:r>
             <w:t xml:space="preserve">    </w:t>
           </w:r>
         </w:sdtContent>
       </w:sdt>
-      <w:permEnd w:id="2031892606"/>
+      <w:permEnd w:id="2044158838"/>
       <w:r>
         <w:t xml:space="preserve">  </w:t>
       </w:r>
@@ -6629,7 +6063,7 @@
         <w:t>.</w:t>
       </w:r>
     </w:p>
-    <w:permStart w:id="991234116" w:edGrp="everyone"/>
+    <w:permStart w:id="198931914" w:edGrp="everyone"/>
     <w:p>
       <w:pPr>
         <w:pStyle w:val="Comment-Grader"/>
@@ -6644,14 +6078,13 @@
           <w15:appearance w15:val="hidden"/>
           <w:text/>
         </w:sdtPr>
-        <w:sdtEndPr/>
         <w:sdtContent>
           <w:r>
             <w:t xml:space="preserve">    </w:t>
           </w:r>
         </w:sdtContent>
       </w:sdt>
-      <w:permEnd w:id="991234116"/>
+      <w:permEnd w:id="198931914"/>
       <w:r>
         <w:t xml:space="preserve">   </w:t>
       </w:r>
@@ -6708,7 +6141,7 @@
         <w:t>.</w:t>
       </w:r>
     </w:p>
-    <w:permStart w:id="745096751" w:edGrp="everyone"/>
+    <w:permStart w:id="1307185674" w:edGrp="everyone"/>
     <w:p>
       <w:pPr>
         <w:pStyle w:val="Comment-Grader"/>
@@ -6723,14 +6156,13 @@
           <w15:appearance w15:val="hidden"/>
           <w:text/>
         </w:sdtPr>
-        <w:sdtEndPr/>
         <w:sdtContent>
           <w:r>
             <w:t xml:space="preserve">    </w:t>
           </w:r>
         </w:sdtContent>
       </w:sdt>
-      <w:permEnd w:id="745096751"/>
+      <w:permEnd w:id="1307185674"/>
       <w:r>
         <w:t xml:space="preserve">   </w:t>
       </w:r>
@@ -7166,7 +6598,7 @@
         <w:t>group or individual deliverables for it to be considered valid.</w:t>
       </w:r>
     </w:p>
-    <w:permStart w:id="361393539" w:edGrp="everyone"/>
+    <w:permStart w:id="1665162078" w:edGrp="everyone"/>
     <w:p>
       <w:pPr>
         <w:pStyle w:val="Comment-Grader"/>
@@ -7181,14 +6613,13 @@
           <w15:appearance w15:val="hidden"/>
           <w:text/>
         </w:sdtPr>
-        <w:sdtEndPr/>
         <w:sdtContent>
           <w:r>
             <w:t xml:space="preserve">    </w:t>
           </w:r>
         </w:sdtContent>
       </w:sdt>
-      <w:permEnd w:id="361393539"/>
+      <w:permEnd w:id="1665162078"/>
       <w:r>
         <w:t xml:space="preserve">  </w:t>
       </w:r>
@@ -7241,7 +6672,7 @@
         <w:t>Produce an analysis report.</w:t>
       </w:r>
     </w:p>
-    <w:permStart w:id="833295285" w:edGrp="everyone"/>
+    <w:permStart w:id="1337547296" w:edGrp="everyone"/>
     <w:p>
       <w:pPr>
         <w:pStyle w:val="Comment-Grader"/>
@@ -7256,14 +6687,13 @@
           <w15:appearance w15:val="hidden"/>
           <w:text/>
         </w:sdtPr>
-        <w:sdtEndPr/>
         <w:sdtContent>
           <w:r>
             <w:t xml:space="preserve">    </w:t>
           </w:r>
         </w:sdtContent>
       </w:sdt>
-      <w:permEnd w:id="833295285"/>
+      <w:permEnd w:id="1337547296"/>
       <w:r>
         <w:t xml:space="preserve">   </w:t>
       </w:r>
@@ -7276,7 +6706,7 @@
         <w:t>Produce a planning and progress report.</w:t>
       </w:r>
     </w:p>
-    <w:permStart w:id="1514348030" w:edGrp="everyone"/>
+    <w:permStart w:id="1168391617" w:edGrp="everyone"/>
     <w:p>
       <w:pPr>
         <w:pStyle w:val="Comment-Grader"/>
@@ -7291,14 +6721,13 @@
           <w15:appearance w15:val="hidden"/>
           <w:text/>
         </w:sdtPr>
-        <w:sdtEndPr/>
         <w:sdtContent>
           <w:r>
             <w:t xml:space="preserve">    </w:t>
           </w:r>
         </w:sdtContent>
       </w:sdt>
-      <w:permEnd w:id="1514348030"/>
+      <w:permEnd w:id="1168391617"/>
       <w:r>
         <w:t xml:space="preserve">     </w:t>
       </w:r>
@@ -7451,7 +6880,7 @@
         <w:t>is properly mocked.</w:t>
       </w:r>
     </w:p>
-    <w:permStart w:id="2092566320" w:edGrp="everyone"/>
+    <w:permStart w:id="1302428298" w:edGrp="everyone"/>
     <w:p>
       <w:pPr>
         <w:pStyle w:val="Comment-Grader"/>
@@ -7466,14 +6895,13 @@
           <w15:appearance w15:val="hidden"/>
           <w:text/>
         </w:sdtPr>
-        <w:sdtEndPr/>
         <w:sdtContent>
           <w:r>
             <w:t xml:space="preserve">    </w:t>
           </w:r>
         </w:sdtContent>
       </w:sdt>
-      <w:permEnd w:id="2092566320"/>
+      <w:permEnd w:id="1302428298"/>
       <w:r>
         <w:t xml:space="preserve">  </w:t>
       </w:r>
@@ -7500,7 +6928,7 @@
         <w:t>Produce an analysis report.</w:t>
       </w:r>
     </w:p>
-    <w:permStart w:id="1306342161" w:edGrp="everyone"/>
+    <w:permStart w:id="1172982747" w:edGrp="everyone"/>
     <w:p>
       <w:pPr>
         <w:pStyle w:val="Comment-Grader"/>
@@ -7515,14 +6943,13 @@
           <w15:appearance w15:val="hidden"/>
           <w:text/>
         </w:sdtPr>
-        <w:sdtEndPr/>
         <w:sdtContent>
           <w:r>
             <w:t xml:space="preserve">    </w:t>
           </w:r>
         </w:sdtContent>
       </w:sdt>
-      <w:permEnd w:id="1306342161"/>
+      <w:permEnd w:id="1172982747"/>
       <w:r>
         <w:t xml:space="preserve">     </w:t>
       </w:r>
@@ -7535,7 +6962,7 @@
         <w:t>Produce a planning and progress report.</w:t>
       </w:r>
     </w:p>
-    <w:permStart w:id="1978161967" w:edGrp="everyone"/>
+    <w:permStart w:id="1531737391" w:edGrp="everyone"/>
     <w:p>
       <w:pPr>
         <w:pStyle w:val="Comment-Grader"/>
@@ -7550,14 +6977,13 @@
           <w15:appearance w15:val="hidden"/>
           <w:text/>
         </w:sdtPr>
-        <w:sdtEndPr/>
         <w:sdtContent>
           <w:r>
             <w:t xml:space="preserve">    </w:t>
           </w:r>
         </w:sdtContent>
       </w:sdt>
-      <w:permEnd w:id="1978161967"/>
+      <w:permEnd w:id="1531737391"/>
       <w:r>
         <w:t xml:space="preserve">      </w:t>
       </w:r>
@@ -7579,9 +7005,6 @@
     <int2:textHash int2:hashCode="apbFNxt1DCEnbZ" int2:id="76W5FpX8">
       <int2:state int2:value="Rejected" int2:type="AugLoop_Text_Critique"/>
     </int2:textHash>
-    <int2:bookmark int2:bookmarkName="_Int_4q4WObMb" int2:invalidationBookmarkName="" int2:hashCode="QHQfPOTE7MbsPj" int2:id="Ns9iK2Rs">
-      <int2:state int2:value="Rejected" int2:type="AugLoop_Text_Critique"/>
-    </int2:bookmark>
   </int2:observations>
   <int2:intelligenceSettings/>
   <int2:onDemandWorkflows/>
@@ -8807,6 +8230,7 @@
   <w:style w:type="character" w:default="1" w:styleId="Fuentedeprrafopredeter">
     <w:name w:val="Default Paragraph Font"/>
     <w:uiPriority w:val="1"/>
+    <w:semiHidden/>
     <w:unhideWhenUsed/>
   </w:style>
   <w:style w:type="table" w:default="1" w:styleId="Tablanormal">
@@ -9320,93 +8744,6 @@
     </w:docPart>
     <w:docPart>
       <w:docPartPr>
-        <w:name w:val="6F786DCD649A47158871CD1D613BC7CC"/>
-        <w:category>
-          <w:name w:val="General"/>
-          <w:gallery w:val="placeholder"/>
-        </w:category>
-        <w:types>
-          <w:type w:val="bbPlcHdr"/>
-        </w:types>
-        <w:behaviors>
-          <w:behavior w:val="content"/>
-        </w:behaviors>
-        <w:guid w:val="{9E835996-0619-46A3-A1D0-655D60E34AD5}"/>
-      </w:docPartPr>
-      <w:docPartBody>
-        <w:p>
-          <w:pPr>
-            <w:pStyle w:val="6F786DCD649A47158871CD1D613BC7CC"/>
-          </w:pPr>
-          <w:r>
-            <w:rPr>
-              <w:rStyle w:val="Textodelmarcadordeposicin"/>
-            </w:rPr>
-            <w:t>Haga clic o pulse aquí para escribir texto.</w:t>
-          </w:r>
-        </w:p>
-      </w:docPartBody>
-    </w:docPart>
-    <w:docPart>
-      <w:docPartPr>
-        <w:name w:val="A5481AD88EA342BBAAB11D688719DEDB"/>
-        <w:category>
-          <w:name w:val="General"/>
-          <w:gallery w:val="placeholder"/>
-        </w:category>
-        <w:types>
-          <w:type w:val="bbPlcHdr"/>
-        </w:types>
-        <w:behaviors>
-          <w:behavior w:val="content"/>
-        </w:behaviors>
-        <w:guid w:val="{C3222A93-8F1E-4705-87F7-D1C024F91F8A}"/>
-      </w:docPartPr>
-      <w:docPartBody>
-        <w:p>
-          <w:pPr>
-            <w:pStyle w:val="A5481AD88EA342BBAAB11D688719DEDB"/>
-          </w:pPr>
-          <w:r>
-            <w:rPr>
-              <w:rStyle w:val="Textodelmarcadordeposicin"/>
-            </w:rPr>
-            <w:t>Haga clic o pulse aquí para escribir texto.</w:t>
-          </w:r>
-        </w:p>
-      </w:docPartBody>
-    </w:docPart>
-    <w:docPart>
-      <w:docPartPr>
-        <w:name w:val="E9193D3C494241F4B256126F24FB602E"/>
-        <w:category>
-          <w:name w:val="General"/>
-          <w:gallery w:val="placeholder"/>
-        </w:category>
-        <w:types>
-          <w:type w:val="bbPlcHdr"/>
-        </w:types>
-        <w:behaviors>
-          <w:behavior w:val="content"/>
-        </w:behaviors>
-        <w:guid w:val="{E83085DB-158E-48BA-BAB3-35BDBB6BBD2B}"/>
-      </w:docPartPr>
-      <w:docPartBody>
-        <w:p>
-          <w:pPr>
-            <w:pStyle w:val="E9193D3C494241F4B256126F24FB602E"/>
-          </w:pPr>
-          <w:r>
-            <w:rPr>
-              <w:rStyle w:val="Textodelmarcadordeposicin"/>
-            </w:rPr>
-            <w:t>Haga clic o pulse aquí para escribir texto.</w:t>
-          </w:r>
-        </w:p>
-      </w:docPartBody>
-    </w:docPart>
-    <w:docPart>
-      <w:docPartPr>
         <w:name w:val="FE6C20A3138E4520815E1903DF6AF182"/>
         <w:category>
           <w:name w:val="General"/>
@@ -9511,93 +8848,6 @@
         <w:p>
           <w:pPr>
             <w:pStyle w:val="FABB13D4D8384F839954E76BD25A68A6"/>
-          </w:pPr>
-          <w:r>
-            <w:rPr>
-              <w:rStyle w:val="Textodelmarcadordeposicin"/>
-            </w:rPr>
-            <w:t>Haga clic o pulse aquí para escribir texto.</w:t>
-          </w:r>
-        </w:p>
-      </w:docPartBody>
-    </w:docPart>
-    <w:docPart>
-      <w:docPartPr>
-        <w:name w:val="D9A40BD86CA043A99F41FFEC09CF32C5"/>
-        <w:category>
-          <w:name w:val="General"/>
-          <w:gallery w:val="placeholder"/>
-        </w:category>
-        <w:types>
-          <w:type w:val="bbPlcHdr"/>
-        </w:types>
-        <w:behaviors>
-          <w:behavior w:val="content"/>
-        </w:behaviors>
-        <w:guid w:val="{27B93908-B731-4430-A263-2834D31B5608}"/>
-      </w:docPartPr>
-      <w:docPartBody>
-        <w:p>
-          <w:pPr>
-            <w:pStyle w:val="D9A40BD86CA043A99F41FFEC09CF32C5"/>
-          </w:pPr>
-          <w:r>
-            <w:rPr>
-              <w:rStyle w:val="Textodelmarcadordeposicin"/>
-            </w:rPr>
-            <w:t>Haga clic o pulse aquí para escribir texto.</w:t>
-          </w:r>
-        </w:p>
-      </w:docPartBody>
-    </w:docPart>
-    <w:docPart>
-      <w:docPartPr>
-        <w:name w:val="83AB65E9A82B4E5D8F27694A6CD354D0"/>
-        <w:category>
-          <w:name w:val="General"/>
-          <w:gallery w:val="placeholder"/>
-        </w:category>
-        <w:types>
-          <w:type w:val="bbPlcHdr"/>
-        </w:types>
-        <w:behaviors>
-          <w:behavior w:val="content"/>
-        </w:behaviors>
-        <w:guid w:val="{0B207B61-258B-4C43-9A3A-F5530B99770F}"/>
-      </w:docPartPr>
-      <w:docPartBody>
-        <w:p>
-          <w:pPr>
-            <w:pStyle w:val="83AB65E9A82B4E5D8F27694A6CD354D0"/>
-          </w:pPr>
-          <w:r>
-            <w:rPr>
-              <w:rStyle w:val="Textodelmarcadordeposicin"/>
-            </w:rPr>
-            <w:t>Haga clic o pulse aquí para escribir texto.</w:t>
-          </w:r>
-        </w:p>
-      </w:docPartBody>
-    </w:docPart>
-    <w:docPart>
-      <w:docPartPr>
-        <w:name w:val="3DB9FE5FE7F54E5B9E63A4AB2D2CB563"/>
-        <w:category>
-          <w:name w:val="General"/>
-          <w:gallery w:val="placeholder"/>
-        </w:category>
-        <w:types>
-          <w:type w:val="bbPlcHdr"/>
-        </w:types>
-        <w:behaviors>
-          <w:behavior w:val="content"/>
-        </w:behaviors>
-        <w:guid w:val="{5FA0DEAE-0F86-4A14-AD40-C285DD0D3247}"/>
-      </w:docPartPr>
-      <w:docPartBody>
-        <w:p>
-          <w:pPr>
-            <w:pStyle w:val="3DB9FE5FE7F54E5B9E63A4AB2D2CB563"/>
           </w:pPr>
           <w:r>
             <w:rPr>
@@ -11281,6 +10531,8 @@
     <w:rsid w:val="001C5FFF"/>
     <w:rsid w:val="00260AAC"/>
     <w:rsid w:val="00336824"/>
+    <w:rsid w:val="00341D30"/>
+    <w:rsid w:val="003544B1"/>
     <w:rsid w:val="00364D10"/>
     <w:rsid w:val="003A10F7"/>
     <w:rsid w:val="003B5C99"/>
@@ -11321,6 +10573,7 @@
     <w:rsid w:val="00940F51"/>
     <w:rsid w:val="00946AA5"/>
     <w:rsid w:val="00953D97"/>
+    <w:rsid w:val="009D587E"/>
     <w:rsid w:val="009F61B1"/>
     <w:rsid w:val="00A011E1"/>
     <w:rsid w:val="00A04483"/>
@@ -11328,6 +10581,7 @@
     <w:rsid w:val="00A222AC"/>
     <w:rsid w:val="00A61663"/>
     <w:rsid w:val="00A73E76"/>
+    <w:rsid w:val="00A77A6B"/>
     <w:rsid w:val="00AC1FAB"/>
     <w:rsid w:val="00B55352"/>
     <w:rsid w:val="00BB0EAB"/>

</xml_diff>

<commit_message>
feat: :memo: Updated documentation
</commit_message>
<xml_diff>
--- a/reports/C2/Group/Group.docx
+++ b/reports/C2/Group/Group.docx
@@ -148,7 +148,13 @@
                   <w:rPr>
                     <w:rFonts w:asciiTheme="majorHAnsi" w:hAnsiTheme="majorHAnsi" w:cstheme="majorHAnsi"/>
                   </w:rPr>
-                  <w:t>1.033</w:t>
+                  <w:t>2</w:t>
+                </w:r>
+                <w:r>
+                  <w:rPr>
+                    <w:rFonts w:asciiTheme="majorHAnsi" w:hAnsiTheme="majorHAnsi" w:cstheme="majorHAnsi"/>
+                  </w:rPr>
+                  <w:t>.033</w:t>
                 </w:r>
                 <w:r>
                   <w:rPr>
@@ -220,7 +226,19 @@
                   <w:rPr>
                     <w:rFonts w:asciiTheme="majorHAnsi" w:hAnsiTheme="majorHAnsi" w:cstheme="majorHAnsi"/>
                   </w:rPr>
-                  <w:t xml:space="preserve"> https://github.com/marrivbec/gii-is-DP2-C1.033.git</w:t>
+                  <w:t xml:space="preserve"> https://github.com/marrivbec/gii-is-DP2-C</w:t>
+                </w:r>
+                <w:r>
+                  <w:rPr>
+                    <w:rFonts w:asciiTheme="majorHAnsi" w:hAnsiTheme="majorHAnsi" w:cstheme="majorHAnsi"/>
+                  </w:rPr>
+                  <w:t>2</w:t>
+                </w:r>
+                <w:r>
+                  <w:rPr>
+                    <w:rFonts w:asciiTheme="majorHAnsi" w:hAnsiTheme="majorHAnsi" w:cstheme="majorHAnsi"/>
+                  </w:rPr>
+                  <w:t>.033.git</w:t>
                 </w:r>
                 <w:r>
                   <w:rPr>
@@ -1003,19 +1021,11 @@
                   </w:rPr>
                   <w:t xml:space="preserve"> </w:t>
                 </w:r>
-                <w:proofErr w:type="spellStart"/>
                 <w:r>
                   <w:rPr>
                     <w:rFonts w:asciiTheme="majorHAnsi" w:hAnsiTheme="majorHAnsi" w:cstheme="majorHAnsi"/>
                   </w:rPr>
-                  <w:t>Baladrón</w:t>
-                </w:r>
-                <w:proofErr w:type="spellEnd"/>
-                <w:r>
-                  <w:rPr>
-                    <w:rFonts w:asciiTheme="majorHAnsi" w:hAnsiTheme="majorHAnsi" w:cstheme="majorHAnsi"/>
-                  </w:rPr>
-                  <w:t xml:space="preserve"> Caballero, Álvaro</w:t>
+                  <w:t>Baladrón Caballero, Álvaro</w:t>
                 </w:r>
                 <w:r>
                   <w:rPr>
@@ -1175,7 +1185,19 @@
                   <w:rPr>
                     <w:rFonts w:asciiTheme="majorHAnsi" w:hAnsiTheme="majorHAnsi" w:cstheme="majorHAnsi"/>
                   </w:rPr>
-                  <w:t>Sevilla February, 2025</w:t>
+                  <w:t xml:space="preserve">Sevilla </w:t>
+                </w:r>
+                <w:r>
+                  <w:rPr>
+                    <w:rFonts w:asciiTheme="majorHAnsi" w:hAnsiTheme="majorHAnsi" w:cstheme="majorHAnsi"/>
+                  </w:rPr>
+                  <w:t>July</w:t>
+                </w:r>
+                <w:r>
+                  <w:rPr>
+                    <w:rFonts w:asciiTheme="majorHAnsi" w:hAnsiTheme="majorHAnsi" w:cstheme="majorHAnsi"/>
+                  </w:rPr>
+                  <w:t>, 2025</w:t>
                 </w:r>
                 <w:r>
                   <w:rPr>
@@ -10583,8 +10605,10 @@
     <w:rsid w:val="00A73E76"/>
     <w:rsid w:val="00A77A6B"/>
     <w:rsid w:val="00AC1FAB"/>
+    <w:rsid w:val="00B440C0"/>
     <w:rsid w:val="00B55352"/>
     <w:rsid w:val="00BB0EAB"/>
+    <w:rsid w:val="00BE669A"/>
     <w:rsid w:val="00C06868"/>
     <w:rsid w:val="00C17266"/>
     <w:rsid w:val="00C63AB0"/>
@@ -10601,10 +10625,12 @@
     <w:rsid w:val="00E9745E"/>
     <w:rsid w:val="00EB4EB9"/>
     <w:rsid w:val="00F3606D"/>
+    <w:rsid w:val="00F41F8F"/>
     <w:rsid w:val="00F6703B"/>
     <w:rsid w:val="00F70A20"/>
     <w:rsid w:val="00F8539E"/>
     <w:rsid w:val="00F970E5"/>
+    <w:rsid w:val="00FD452D"/>
     <w:rsid w:val="00FE6BFD"/>
   </w:rsids>
   <m:mathPr>

</xml_diff>

<commit_message>
feat: :memo: Modified documents
</commit_message>
<xml_diff>
--- a/reports/C2/Group/Group.docx
+++ b/reports/C2/Group/Group.docx
@@ -123,7 +123,7 @@
               </w:rPr>
               <w:tab/>
             </w:r>
-            <w:permStart w:id="1577268823" w:edGrp="everyone"/>
+            <w:permStart w:id="143746294" w:edGrp="everyone"/>
             <w:sdt>
               <w:sdtPr>
                 <w:rPr>
@@ -164,7 +164,7 @@
                 </w:r>
               </w:sdtContent>
             </w:sdt>
-            <w:permEnd w:id="1577268823"/>
+            <w:permEnd w:id="143746294"/>
           </w:p>
         </w:tc>
       </w:tr>
@@ -207,7 +207,7 @@
               </w:rPr>
               <w:tab/>
             </w:r>
-            <w:permStart w:id="1051094094" w:edGrp="everyone"/>
+            <w:permStart w:id="420692352" w:edGrp="everyone"/>
             <w:sdt>
               <w:sdtPr>
                 <w:rPr>
@@ -248,7 +248,7 @@
                 </w:r>
               </w:sdtContent>
             </w:sdt>
-            <w:permEnd w:id="1051094094"/>
+            <w:permEnd w:id="420692352"/>
           </w:p>
         </w:tc>
       </w:tr>
@@ -300,7 +300,7 @@
               </w:rPr>
               <w:tab/>
             </w:r>
-            <w:permStart w:id="650781575" w:edGrp="everyone"/>
+            <w:permStart w:id="291510380" w:edGrp="everyone"/>
             <w:sdt>
               <w:sdtPr>
                 <w:rPr>
@@ -330,7 +330,7 @@
               </w:sdtContent>
             </w:sdt>
           </w:p>
-          <w:permEnd w:id="650781575"/>
+          <w:permEnd w:id="291510380"/>
           <w:p>
             <w:pPr>
               <w:pStyle w:val="Sinespaciado"/>
@@ -360,7 +360,7 @@
               </w:rPr>
               <w:tab/>
             </w:r>
-            <w:permStart w:id="1970822259" w:edGrp="everyone"/>
+            <w:permStart w:id="1364481481" w:edGrp="everyone"/>
             <w:sdt>
               <w:sdtPr>
                 <w:rPr>
@@ -395,7 +395,7 @@
                 </w:r>
               </w:sdtContent>
             </w:sdt>
-            <w:permEnd w:id="1970822259"/>
+            <w:permEnd w:id="1364481481"/>
           </w:p>
           <w:p>
             <w:pPr>
@@ -424,7 +424,7 @@
               </w:rPr>
               <w:tab/>
             </w:r>
-            <w:permStart w:id="1476810082" w:edGrp="everyone"/>
+            <w:permStart w:id="1443845444" w:edGrp="everyone"/>
             <w:sdt>
               <w:sdtPr>
                 <w:rPr>
@@ -459,7 +459,7 @@
                 </w:r>
               </w:sdtContent>
             </w:sdt>
-            <w:permEnd w:id="1476810082"/>
+            <w:permEnd w:id="1443845444"/>
             <w:r>
               <w:rPr>
                 <w:rFonts w:asciiTheme="majorHAnsi" w:hAnsiTheme="majorHAnsi" w:cstheme="majorHAnsi"/>
@@ -488,7 +488,7 @@
               </w:rPr>
               <w:tab/>
             </w:r>
-            <w:permStart w:id="869479214" w:edGrp="everyone"/>
+            <w:permStart w:id="415123737" w:edGrp="everyone"/>
             <w:sdt>
               <w:sdtPr>
                 <w:rPr>
@@ -523,7 +523,7 @@
                 </w:r>
               </w:sdtContent>
             </w:sdt>
-            <w:permEnd w:id="869479214"/>
+            <w:permEnd w:id="415123737"/>
           </w:p>
         </w:tc>
         <w:tc>
@@ -537,12 +537,400 @@
             </w:tcMar>
           </w:tcPr>
           <w:p>
+            <w:r>
+              <w:t>Student #2</w:t>
+            </w:r>
+          </w:p>
+          <w:p>
+            <w:pPr>
+              <w:pStyle w:val="Sinespaciado"/>
+              <w:rPr>
+                <w:rFonts w:asciiTheme="majorHAnsi" w:hAnsiTheme="majorHAnsi" w:cstheme="majorHAnsi"/>
+                <w:b/>
+              </w:rPr>
+            </w:pPr>
+            <w:r>
+              <w:rPr>
+                <w:rFonts w:asciiTheme="majorHAnsi" w:hAnsiTheme="majorHAnsi" w:cstheme="majorHAnsi"/>
+                <w:b/>
+              </w:rPr>
+              <w:t>ID:</w:t>
+            </w:r>
+            <w:r>
+              <w:rPr>
+                <w:rFonts w:asciiTheme="majorHAnsi" w:hAnsiTheme="majorHAnsi" w:cstheme="majorHAnsi"/>
+                <w:b/>
+              </w:rPr>
+              <w:tab/>
+            </w:r>
+            <w:r>
+              <w:rPr>
+                <w:rFonts w:asciiTheme="majorHAnsi" w:hAnsiTheme="majorHAnsi" w:cstheme="majorHAnsi"/>
+              </w:rPr>
+              <w:tab/>
+            </w:r>
+            <w:permStart w:id="1081366304" w:edGrp="everyone"/>
+            <w:r>
+              <w:rPr>
+                <w:rFonts w:asciiTheme="majorHAnsi" w:hAnsiTheme="majorHAnsi" w:cstheme="majorHAnsi"/>
+              </w:rPr>
+              <w:t xml:space="preserve"> </w:t>
+            </w:r>
+            <w:sdt>
+              <w:sdtPr>
+                <w:rPr>
+                  <w:rFonts w:asciiTheme="majorHAnsi" w:hAnsiTheme="majorHAnsi" w:cstheme="majorBidi"/>
+                </w:rPr>
+                <w:tag w:val="ID2"/>
+                <w:id w:val="-1276937016"/>
+                <w:placeholder>
+                  <w:docPart w:val="6F786DCD649A47158871CD1D613BC7CC"/>
+                </w:placeholder>
+                <w15:appearance w15:val="hidden"/>
+                <w:text/>
+              </w:sdtPr>
+              <w:sdtContent>
+                <w:proofErr w:type="spellStart"/>
+                <w:r>
+                  <w:rPr>
+                    <w:rFonts w:asciiTheme="majorHAnsi" w:hAnsiTheme="majorHAnsi" w:cstheme="majorBidi"/>
+                  </w:rPr>
+                  <w:t>Intencionadamente</w:t>
+                </w:r>
+                <w:proofErr w:type="spellEnd"/>
+                <w:r>
+                  <w:rPr>
+                    <w:rFonts w:asciiTheme="majorHAnsi" w:hAnsiTheme="majorHAnsi" w:cstheme="majorBidi"/>
+                  </w:rPr>
+                  <w:t xml:space="preserve"> </w:t>
+                </w:r>
+                <w:proofErr w:type="spellStart"/>
+                <w:r>
+                  <w:rPr>
+                    <w:rFonts w:asciiTheme="majorHAnsi" w:hAnsiTheme="majorHAnsi" w:cstheme="majorBidi"/>
+                  </w:rPr>
+                  <w:t>en</w:t>
+                </w:r>
+                <w:proofErr w:type="spellEnd"/>
+                <w:r>
+                  <w:rPr>
+                    <w:rFonts w:asciiTheme="majorHAnsi" w:hAnsiTheme="majorHAnsi" w:cstheme="majorBidi"/>
+                  </w:rPr>
+                  <w:t xml:space="preserve"> </w:t>
+                </w:r>
+                <w:proofErr w:type="spellStart"/>
+                <w:r>
+                  <w:rPr>
+                    <w:rFonts w:asciiTheme="majorHAnsi" w:hAnsiTheme="majorHAnsi" w:cstheme="majorBidi"/>
+                  </w:rPr>
+                  <w:t>blanco</w:t>
+                </w:r>
+                <w:proofErr w:type="spellEnd"/>
+              </w:sdtContent>
+            </w:sdt>
+          </w:p>
+          <w:permEnd w:id="1081366304"/>
+          <w:p>
+            <w:pPr>
+              <w:pStyle w:val="Sinespaciado"/>
+              <w:rPr>
+                <w:rFonts w:asciiTheme="majorHAnsi" w:hAnsiTheme="majorHAnsi" w:cstheme="majorHAnsi"/>
+                <w:b/>
+              </w:rPr>
+            </w:pPr>
+            <w:r>
+              <w:rPr>
+                <w:rFonts w:asciiTheme="majorHAnsi" w:hAnsiTheme="majorHAnsi" w:cstheme="majorHAnsi"/>
+                <w:b/>
+              </w:rPr>
+              <w:t xml:space="preserve">UVUS: </w:t>
+            </w:r>
+            <w:r>
+              <w:rPr>
+                <w:rFonts w:asciiTheme="majorHAnsi" w:hAnsiTheme="majorHAnsi" w:cstheme="majorHAnsi"/>
+                <w:b/>
+              </w:rPr>
+              <w:tab/>
+            </w:r>
+            <w:r>
+              <w:rPr>
+                <w:rFonts w:asciiTheme="majorHAnsi" w:hAnsiTheme="majorHAnsi" w:cstheme="majorHAnsi"/>
+                <w:b/>
+              </w:rPr>
+              <w:tab/>
+            </w:r>
+            <w:permStart w:id="554395221" w:edGrp="everyone"/>
+            <w:sdt>
+              <w:sdtPr>
+                <w:rPr>
+                  <w:rFonts w:asciiTheme="majorHAnsi" w:hAnsiTheme="majorHAnsi" w:cstheme="majorBidi"/>
+                </w:rPr>
+                <w:tag w:val="UVUS02"/>
+                <w:id w:val="1381354132"/>
+                <w:placeholder>
+                  <w:docPart w:val="A5481AD88EA342BBAAB11D688719DEDB"/>
+                </w:placeholder>
+                <w15:appearance w15:val="hidden"/>
+                <w:text/>
+              </w:sdtPr>
+              <w:sdtContent>
+                <w:r>
+                  <w:rPr>
+                    <w:rFonts w:asciiTheme="majorHAnsi" w:hAnsiTheme="majorHAnsi" w:cstheme="majorBidi"/>
+                  </w:rPr>
+                  <w:t xml:space="preserve"> </w:t>
+                </w:r>
+                <w:proofErr w:type="spellStart"/>
+                <w:r>
+                  <w:rPr>
+                    <w:rFonts w:asciiTheme="majorHAnsi" w:hAnsiTheme="majorHAnsi" w:cstheme="majorBidi"/>
+                  </w:rPr>
+                  <w:t>Intencionadamente</w:t>
+                </w:r>
+                <w:proofErr w:type="spellEnd"/>
+                <w:r>
+                  <w:rPr>
+                    <w:rFonts w:asciiTheme="majorHAnsi" w:hAnsiTheme="majorHAnsi" w:cstheme="majorBidi"/>
+                  </w:rPr>
+                  <w:t xml:space="preserve"> </w:t>
+                </w:r>
+                <w:proofErr w:type="spellStart"/>
+                <w:r>
+                  <w:rPr>
+                    <w:rFonts w:asciiTheme="majorHAnsi" w:hAnsiTheme="majorHAnsi" w:cstheme="majorBidi"/>
+                  </w:rPr>
+                  <w:t>en</w:t>
+                </w:r>
+                <w:proofErr w:type="spellEnd"/>
+                <w:r>
+                  <w:rPr>
+                    <w:rFonts w:asciiTheme="majorHAnsi" w:hAnsiTheme="majorHAnsi" w:cstheme="majorBidi"/>
+                  </w:rPr>
+                  <w:t xml:space="preserve"> </w:t>
+                </w:r>
+                <w:proofErr w:type="spellStart"/>
+                <w:r>
+                  <w:rPr>
+                    <w:rFonts w:asciiTheme="majorHAnsi" w:hAnsiTheme="majorHAnsi" w:cstheme="majorBidi"/>
+                  </w:rPr>
+                  <w:t>blanco</w:t>
+                </w:r>
+                <w:proofErr w:type="spellEnd"/>
+                <w:r>
+                  <w:rPr>
+                    <w:rFonts w:asciiTheme="majorHAnsi" w:hAnsiTheme="majorHAnsi" w:cstheme="majorBidi"/>
+                  </w:rPr>
+                  <w:t xml:space="preserve"> </w:t>
+                </w:r>
+                <w:r>
+                  <w:rPr>
+                    <w:rFonts w:asciiTheme="majorHAnsi" w:hAnsiTheme="majorHAnsi" w:cstheme="majorBidi"/>
+                  </w:rPr>
+                  <w:t xml:space="preserve"> </w:t>
+                </w:r>
+              </w:sdtContent>
+            </w:sdt>
+            <w:permEnd w:id="554395221"/>
+          </w:p>
+          <w:p>
             <w:pPr>
               <w:pStyle w:val="Sinespaciado"/>
               <w:rPr>
                 <w:rFonts w:asciiTheme="majorHAnsi" w:hAnsiTheme="majorHAnsi" w:cstheme="majorHAnsi"/>
               </w:rPr>
             </w:pPr>
+            <w:r>
+              <w:rPr>
+                <w:rFonts w:asciiTheme="majorHAnsi" w:hAnsiTheme="majorHAnsi" w:cstheme="majorHAnsi"/>
+                <w:b/>
+              </w:rPr>
+              <w:t>Name:</w:t>
+            </w:r>
+            <w:r>
+              <w:rPr>
+                <w:rFonts w:asciiTheme="majorHAnsi" w:hAnsiTheme="majorHAnsi" w:cstheme="majorHAnsi"/>
+                <w:b/>
+              </w:rPr>
+              <w:tab/>
+            </w:r>
+            <w:r>
+              <w:rPr>
+                <w:rFonts w:asciiTheme="majorHAnsi" w:hAnsiTheme="majorHAnsi" w:cstheme="majorHAnsi"/>
+              </w:rPr>
+              <w:tab/>
+            </w:r>
+            <w:permStart w:id="84825807" w:edGrp="everyone"/>
+            <w:sdt>
+              <w:sdtPr>
+                <w:rPr>
+                  <w:rFonts w:asciiTheme="majorHAnsi" w:hAnsiTheme="majorHAnsi" w:cstheme="majorBidi"/>
+                </w:rPr>
+                <w:tag w:val="Student2"/>
+                <w:id w:val="2044784553"/>
+                <w:placeholder>
+                  <w:docPart w:val="E9193D3C494241F4B256126F24FB602E"/>
+                </w:placeholder>
+                <w15:appearance w15:val="hidden"/>
+                <w:text/>
+              </w:sdtPr>
+              <w:sdtContent>
+                <w:r>
+                  <w:rPr>
+                    <w:rFonts w:asciiTheme="majorHAnsi" w:hAnsiTheme="majorHAnsi" w:cstheme="majorBidi"/>
+                  </w:rPr>
+                  <w:t xml:space="preserve"> </w:t>
+                </w:r>
+                <w:proofErr w:type="spellStart"/>
+                <w:r>
+                  <w:rPr>
+                    <w:rFonts w:asciiTheme="majorHAnsi" w:hAnsiTheme="majorHAnsi" w:cstheme="majorBidi"/>
+                  </w:rPr>
+                  <w:t>Intencionadamente</w:t>
+                </w:r>
+                <w:proofErr w:type="spellEnd"/>
+                <w:r>
+                  <w:rPr>
+                    <w:rFonts w:asciiTheme="majorHAnsi" w:hAnsiTheme="majorHAnsi" w:cstheme="majorBidi"/>
+                  </w:rPr>
+                  <w:t xml:space="preserve"> </w:t>
+                </w:r>
+                <w:proofErr w:type="spellStart"/>
+                <w:r>
+                  <w:rPr>
+                    <w:rFonts w:asciiTheme="majorHAnsi" w:hAnsiTheme="majorHAnsi" w:cstheme="majorBidi"/>
+                  </w:rPr>
+                  <w:t>en</w:t>
+                </w:r>
+                <w:proofErr w:type="spellEnd"/>
+                <w:r>
+                  <w:rPr>
+                    <w:rFonts w:asciiTheme="majorHAnsi" w:hAnsiTheme="majorHAnsi" w:cstheme="majorBidi"/>
+                  </w:rPr>
+                  <w:t xml:space="preserve"> </w:t>
+                </w:r>
+                <w:proofErr w:type="spellStart"/>
+                <w:r>
+                  <w:rPr>
+                    <w:rFonts w:asciiTheme="majorHAnsi" w:hAnsiTheme="majorHAnsi" w:cstheme="majorBidi"/>
+                  </w:rPr>
+                  <w:t>blanco</w:t>
+                </w:r>
+                <w:proofErr w:type="spellEnd"/>
+                <w:r>
+                  <w:rPr>
+                    <w:rFonts w:asciiTheme="majorHAnsi" w:hAnsiTheme="majorHAnsi" w:cstheme="majorBidi"/>
+                  </w:rPr>
+                  <w:t xml:space="preserve"> </w:t>
+                </w:r>
+                <w:r>
+                  <w:rPr>
+                    <w:rFonts w:asciiTheme="majorHAnsi" w:hAnsiTheme="majorHAnsi" w:cstheme="majorBidi"/>
+                  </w:rPr>
+                  <w:t xml:space="preserve"> </w:t>
+                </w:r>
+              </w:sdtContent>
+            </w:sdt>
+            <w:permEnd w:id="84825807"/>
+          </w:p>
+          <w:p>
+            <w:pPr>
+              <w:pStyle w:val="Sinespaciado"/>
+              <w:rPr>
+                <w:rFonts w:asciiTheme="majorHAnsi" w:hAnsiTheme="majorHAnsi" w:cstheme="majorHAnsi"/>
+              </w:rPr>
+            </w:pPr>
+            <w:r>
+              <w:rPr>
+                <w:rFonts w:asciiTheme="majorHAnsi" w:hAnsiTheme="majorHAnsi" w:cstheme="majorHAnsi"/>
+                <w:b/>
+              </w:rPr>
+              <w:t>Roles:</w:t>
+            </w:r>
+            <w:r>
+              <w:rPr>
+                <w:rFonts w:asciiTheme="majorHAnsi" w:hAnsiTheme="majorHAnsi" w:cstheme="majorHAnsi"/>
+                <w:b/>
+              </w:rPr>
+              <w:tab/>
+            </w:r>
+            <w:r>
+              <w:rPr>
+                <w:rFonts w:asciiTheme="majorHAnsi" w:hAnsiTheme="majorHAnsi" w:cstheme="majorHAnsi"/>
+              </w:rPr>
+              <w:tab/>
+            </w:r>
+            <w:permStart w:id="584389830" w:edGrp="everyone"/>
+            <w:sdt>
+              <w:sdtPr>
+                <w:rPr>
+                  <w:rFonts w:asciiTheme="majorHAnsi" w:hAnsiTheme="majorHAnsi" w:cstheme="majorBidi"/>
+                </w:rPr>
+                <w:tag w:val="Roles2"/>
+                <w:id w:val="-1975901162"/>
+                <w:placeholder>
+                  <w:docPart w:val="E9193D3C494241F4B256126F24FB602E"/>
+                </w:placeholder>
+                <w15:appearance w15:val="hidden"/>
+                <w:text/>
+              </w:sdtPr>
+              <w:sdtContent>
+                <w:r>
+                  <w:rPr>
+                    <w:rFonts w:asciiTheme="majorHAnsi" w:hAnsiTheme="majorHAnsi" w:cstheme="majorBidi"/>
+                  </w:rPr>
+                  <w:t xml:space="preserve"> </w:t>
+                </w:r>
+                <w:proofErr w:type="spellStart"/>
+                <w:r>
+                  <w:rPr>
+                    <w:rFonts w:asciiTheme="majorHAnsi" w:hAnsiTheme="majorHAnsi" w:cstheme="majorBidi"/>
+                  </w:rPr>
+                  <w:t>Intencionadamente</w:t>
+                </w:r>
+                <w:proofErr w:type="spellEnd"/>
+                <w:r>
+                  <w:rPr>
+                    <w:rFonts w:asciiTheme="majorHAnsi" w:hAnsiTheme="majorHAnsi" w:cstheme="majorBidi"/>
+                  </w:rPr>
+                  <w:t xml:space="preserve"> </w:t>
+                </w:r>
+                <w:proofErr w:type="spellStart"/>
+                <w:r>
+                  <w:rPr>
+                    <w:rFonts w:asciiTheme="majorHAnsi" w:hAnsiTheme="majorHAnsi" w:cstheme="majorBidi"/>
+                  </w:rPr>
+                  <w:t>en</w:t>
+                </w:r>
+                <w:proofErr w:type="spellEnd"/>
+                <w:r>
+                  <w:rPr>
+                    <w:rFonts w:asciiTheme="majorHAnsi" w:hAnsiTheme="majorHAnsi" w:cstheme="majorBidi"/>
+                  </w:rPr>
+                  <w:t xml:space="preserve"> </w:t>
+                </w:r>
+                <w:proofErr w:type="spellStart"/>
+                <w:r>
+                  <w:rPr>
+                    <w:rFonts w:asciiTheme="majorHAnsi" w:hAnsiTheme="majorHAnsi" w:cstheme="majorBidi"/>
+                  </w:rPr>
+                  <w:t>blanco</w:t>
+                </w:r>
+                <w:proofErr w:type="spellEnd"/>
+                <w:r>
+                  <w:rPr>
+                    <w:rFonts w:asciiTheme="majorHAnsi" w:hAnsiTheme="majorHAnsi" w:cstheme="majorBidi"/>
+                  </w:rPr>
+                  <w:t xml:space="preserve"> </w:t>
+                </w:r>
+                <w:r>
+                  <w:rPr>
+                    <w:rFonts w:asciiTheme="majorHAnsi" w:hAnsiTheme="majorHAnsi" w:cstheme="majorBidi"/>
+                  </w:rPr>
+                  <w:t xml:space="preserve"> </w:t>
+                </w:r>
+              </w:sdtContent>
+            </w:sdt>
+            <w:permEnd w:id="584389830"/>
           </w:p>
         </w:tc>
       </w:tr>
@@ -593,7 +981,7 @@
               </w:rPr>
               <w:tab/>
             </w:r>
-            <w:permStart w:id="154871226" w:edGrp="everyone"/>
+            <w:permStart w:id="1000832359" w:edGrp="everyone"/>
             <w:sdt>
               <w:sdtPr>
                 <w:rPr>
@@ -623,7 +1011,7 @@
               </w:sdtContent>
             </w:sdt>
           </w:p>
-          <w:permEnd w:id="154871226"/>
+          <w:permEnd w:id="1000832359"/>
           <w:p>
             <w:pPr>
               <w:pStyle w:val="Sinespaciado"/>
@@ -653,7 +1041,7 @@
               </w:rPr>
               <w:tab/>
             </w:r>
-            <w:permStart w:id="1640057369" w:edGrp="everyone"/>
+            <w:permStart w:id="926035648" w:edGrp="everyone"/>
             <w:sdt>
               <w:sdtPr>
                 <w:rPr>
@@ -688,7 +1076,7 @@
                 </w:r>
               </w:sdtContent>
             </w:sdt>
-            <w:permEnd w:id="1640057369"/>
+            <w:permEnd w:id="926035648"/>
           </w:p>
           <w:p>
             <w:pPr>
@@ -717,7 +1105,7 @@
               </w:rPr>
               <w:tab/>
             </w:r>
-            <w:permStart w:id="1311537899" w:edGrp="everyone"/>
+            <w:permStart w:id="1519068571" w:edGrp="everyone"/>
             <w:sdt>
               <w:sdtPr>
                 <w:rPr>
@@ -747,7 +1135,7 @@
               </w:sdtContent>
             </w:sdt>
           </w:p>
-          <w:permEnd w:id="1311537899"/>
+          <w:permEnd w:id="1519068571"/>
           <w:p>
             <w:pPr>
               <w:pStyle w:val="Sinespaciado"/>
@@ -775,7 +1163,7 @@
               </w:rPr>
               <w:tab/>
             </w:r>
-            <w:permStart w:id="458437268" w:edGrp="everyone"/>
+            <w:permStart w:id="1983335098" w:edGrp="everyone"/>
             <w:sdt>
               <w:sdtPr>
                 <w:rPr>
@@ -809,7 +1197,7 @@
                 </w:r>
               </w:sdtContent>
             </w:sdt>
-            <w:permEnd w:id="458437268"/>
+            <w:permEnd w:id="1983335098"/>
           </w:p>
         </w:tc>
         <w:tc>
@@ -823,12 +1211,400 @@
             </w:tcMar>
           </w:tcPr>
           <w:p>
+            <w:r>
+              <w:t>Student #4</w:t>
+            </w:r>
+          </w:p>
+          <w:p>
+            <w:pPr>
+              <w:pStyle w:val="Sinespaciado"/>
+              <w:rPr>
+                <w:rFonts w:asciiTheme="majorHAnsi" w:hAnsiTheme="majorHAnsi" w:cstheme="majorHAnsi"/>
+                <w:b/>
+              </w:rPr>
+            </w:pPr>
+            <w:r>
+              <w:rPr>
+                <w:rFonts w:asciiTheme="majorHAnsi" w:hAnsiTheme="majorHAnsi" w:cstheme="majorHAnsi"/>
+                <w:b/>
+              </w:rPr>
+              <w:t>ID:</w:t>
+            </w:r>
+            <w:r>
+              <w:rPr>
+                <w:rFonts w:asciiTheme="majorHAnsi" w:hAnsiTheme="majorHAnsi" w:cstheme="majorHAnsi"/>
+                <w:b/>
+              </w:rPr>
+              <w:tab/>
+            </w:r>
+            <w:r>
+              <w:rPr>
+                <w:rFonts w:asciiTheme="majorHAnsi" w:hAnsiTheme="majorHAnsi" w:cstheme="majorHAnsi"/>
+              </w:rPr>
+              <w:tab/>
+            </w:r>
+            <w:permStart w:id="1222207409" w:edGrp="everyone"/>
+            <w:sdt>
+              <w:sdtPr>
+                <w:rPr>
+                  <w:rFonts w:asciiTheme="majorHAnsi" w:hAnsiTheme="majorHAnsi" w:cstheme="majorBidi"/>
+                </w:rPr>
+                <w:tag w:val="ID4"/>
+                <w:id w:val="577182649"/>
+                <w:placeholder>
+                  <w:docPart w:val="D9A40BD86CA043A99F41FFEC09CF32C5"/>
+                </w:placeholder>
+                <w15:appearance w15:val="hidden"/>
+                <w:text/>
+              </w:sdtPr>
+              <w:sdtContent>
+                <w:r>
+                  <w:rPr>
+                    <w:rFonts w:asciiTheme="majorHAnsi" w:hAnsiTheme="majorHAnsi" w:cstheme="majorBidi"/>
+                  </w:rPr>
+                  <w:t xml:space="preserve"> </w:t>
+                </w:r>
+                <w:proofErr w:type="spellStart"/>
+                <w:r>
+                  <w:rPr>
+                    <w:rFonts w:asciiTheme="majorHAnsi" w:hAnsiTheme="majorHAnsi" w:cstheme="majorBidi"/>
+                  </w:rPr>
+                  <w:t>Intencionadamente</w:t>
+                </w:r>
+                <w:proofErr w:type="spellEnd"/>
+                <w:r>
+                  <w:rPr>
+                    <w:rFonts w:asciiTheme="majorHAnsi" w:hAnsiTheme="majorHAnsi" w:cstheme="majorBidi"/>
+                  </w:rPr>
+                  <w:t xml:space="preserve"> </w:t>
+                </w:r>
+                <w:proofErr w:type="spellStart"/>
+                <w:r>
+                  <w:rPr>
+                    <w:rFonts w:asciiTheme="majorHAnsi" w:hAnsiTheme="majorHAnsi" w:cstheme="majorBidi"/>
+                  </w:rPr>
+                  <w:t>en</w:t>
+                </w:r>
+                <w:proofErr w:type="spellEnd"/>
+                <w:r>
+                  <w:rPr>
+                    <w:rFonts w:asciiTheme="majorHAnsi" w:hAnsiTheme="majorHAnsi" w:cstheme="majorBidi"/>
+                  </w:rPr>
+                  <w:t xml:space="preserve"> </w:t>
+                </w:r>
+                <w:proofErr w:type="spellStart"/>
+                <w:r>
+                  <w:rPr>
+                    <w:rFonts w:asciiTheme="majorHAnsi" w:hAnsiTheme="majorHAnsi" w:cstheme="majorBidi"/>
+                  </w:rPr>
+                  <w:t>blanco</w:t>
+                </w:r>
+                <w:proofErr w:type="spellEnd"/>
+              </w:sdtContent>
+            </w:sdt>
+          </w:p>
+          <w:permEnd w:id="1222207409"/>
+          <w:p>
+            <w:pPr>
+              <w:pStyle w:val="Sinespaciado"/>
+              <w:rPr>
+                <w:rFonts w:asciiTheme="majorHAnsi" w:hAnsiTheme="majorHAnsi" w:cstheme="majorHAnsi"/>
+                <w:b/>
+              </w:rPr>
+            </w:pPr>
+            <w:r>
+              <w:rPr>
+                <w:rFonts w:asciiTheme="majorHAnsi" w:hAnsiTheme="majorHAnsi" w:cstheme="majorHAnsi"/>
+                <w:b/>
+              </w:rPr>
+              <w:t xml:space="preserve">UVUS: </w:t>
+            </w:r>
+            <w:r>
+              <w:rPr>
+                <w:rFonts w:asciiTheme="majorHAnsi" w:hAnsiTheme="majorHAnsi" w:cstheme="majorHAnsi"/>
+                <w:b/>
+              </w:rPr>
+              <w:tab/>
+            </w:r>
+            <w:r>
+              <w:rPr>
+                <w:rFonts w:asciiTheme="majorHAnsi" w:hAnsiTheme="majorHAnsi" w:cstheme="majorHAnsi"/>
+                <w:b/>
+              </w:rPr>
+              <w:tab/>
+            </w:r>
+            <w:permStart w:id="484340907" w:edGrp="everyone"/>
+            <w:sdt>
+              <w:sdtPr>
+                <w:rPr>
+                  <w:rFonts w:asciiTheme="majorHAnsi" w:hAnsiTheme="majorHAnsi" w:cstheme="majorBidi"/>
+                </w:rPr>
+                <w:tag w:val="UVUS04"/>
+                <w:id w:val="-1772313792"/>
+                <w:placeholder>
+                  <w:docPart w:val="83AB65E9A82B4E5D8F27694A6CD354D0"/>
+                </w:placeholder>
+                <w15:appearance w15:val="hidden"/>
+                <w:text/>
+              </w:sdtPr>
+              <w:sdtContent>
+                <w:r>
+                  <w:rPr>
+                    <w:rFonts w:asciiTheme="majorHAnsi" w:hAnsiTheme="majorHAnsi" w:cstheme="majorBidi"/>
+                  </w:rPr>
+                  <w:t xml:space="preserve"> </w:t>
+                </w:r>
+                <w:proofErr w:type="spellStart"/>
+                <w:r>
+                  <w:rPr>
+                    <w:rFonts w:asciiTheme="majorHAnsi" w:hAnsiTheme="majorHAnsi" w:cstheme="majorBidi"/>
+                  </w:rPr>
+                  <w:t>Intencionadamente</w:t>
+                </w:r>
+                <w:proofErr w:type="spellEnd"/>
+                <w:r>
+                  <w:rPr>
+                    <w:rFonts w:asciiTheme="majorHAnsi" w:hAnsiTheme="majorHAnsi" w:cstheme="majorBidi"/>
+                  </w:rPr>
+                  <w:t xml:space="preserve"> </w:t>
+                </w:r>
+                <w:proofErr w:type="spellStart"/>
+                <w:r>
+                  <w:rPr>
+                    <w:rFonts w:asciiTheme="majorHAnsi" w:hAnsiTheme="majorHAnsi" w:cstheme="majorBidi"/>
+                  </w:rPr>
+                  <w:t>en</w:t>
+                </w:r>
+                <w:proofErr w:type="spellEnd"/>
+                <w:r>
+                  <w:rPr>
+                    <w:rFonts w:asciiTheme="majorHAnsi" w:hAnsiTheme="majorHAnsi" w:cstheme="majorBidi"/>
+                  </w:rPr>
+                  <w:t xml:space="preserve"> </w:t>
+                </w:r>
+                <w:proofErr w:type="spellStart"/>
+                <w:r>
+                  <w:rPr>
+                    <w:rFonts w:asciiTheme="majorHAnsi" w:hAnsiTheme="majorHAnsi" w:cstheme="majorBidi"/>
+                  </w:rPr>
+                  <w:t>blanco</w:t>
+                </w:r>
+                <w:proofErr w:type="spellEnd"/>
+                <w:r>
+                  <w:rPr>
+                    <w:rFonts w:asciiTheme="majorHAnsi" w:hAnsiTheme="majorHAnsi" w:cstheme="majorBidi"/>
+                  </w:rPr>
+                  <w:t xml:space="preserve"> </w:t>
+                </w:r>
+                <w:r>
+                  <w:rPr>
+                    <w:rFonts w:asciiTheme="majorHAnsi" w:hAnsiTheme="majorHAnsi" w:cstheme="majorBidi"/>
+                  </w:rPr>
+                  <w:t xml:space="preserve"> </w:t>
+                </w:r>
+              </w:sdtContent>
+            </w:sdt>
+            <w:permEnd w:id="484340907"/>
+          </w:p>
+          <w:p>
             <w:pPr>
               <w:pStyle w:val="Sinespaciado"/>
               <w:rPr>
                 <w:rFonts w:asciiTheme="majorHAnsi" w:hAnsiTheme="majorHAnsi" w:cstheme="majorHAnsi"/>
               </w:rPr>
             </w:pPr>
+            <w:r>
+              <w:rPr>
+                <w:rFonts w:asciiTheme="majorHAnsi" w:hAnsiTheme="majorHAnsi" w:cstheme="majorHAnsi"/>
+                <w:b/>
+              </w:rPr>
+              <w:t>Name:</w:t>
+            </w:r>
+            <w:r>
+              <w:rPr>
+                <w:rFonts w:asciiTheme="majorHAnsi" w:hAnsiTheme="majorHAnsi" w:cstheme="majorHAnsi"/>
+                <w:b/>
+              </w:rPr>
+              <w:tab/>
+            </w:r>
+            <w:r>
+              <w:rPr>
+                <w:rFonts w:asciiTheme="majorHAnsi" w:hAnsiTheme="majorHAnsi" w:cstheme="majorHAnsi"/>
+              </w:rPr>
+              <w:tab/>
+            </w:r>
+            <w:permStart w:id="386604040" w:edGrp="everyone"/>
+            <w:sdt>
+              <w:sdtPr>
+                <w:rPr>
+                  <w:rFonts w:asciiTheme="majorHAnsi" w:hAnsiTheme="majorHAnsi" w:cstheme="majorBidi"/>
+                </w:rPr>
+                <w:tag w:val="Student4"/>
+                <w:id w:val="-924030127"/>
+                <w:placeholder>
+                  <w:docPart w:val="3DB9FE5FE7F54E5B9E63A4AB2D2CB563"/>
+                </w:placeholder>
+                <w15:appearance w15:val="hidden"/>
+                <w:text/>
+              </w:sdtPr>
+              <w:sdtContent>
+                <w:r>
+                  <w:rPr>
+                    <w:rFonts w:asciiTheme="majorHAnsi" w:hAnsiTheme="majorHAnsi" w:cstheme="majorBidi"/>
+                  </w:rPr>
+                  <w:t xml:space="preserve"> </w:t>
+                </w:r>
+                <w:proofErr w:type="spellStart"/>
+                <w:r>
+                  <w:rPr>
+                    <w:rFonts w:asciiTheme="majorHAnsi" w:hAnsiTheme="majorHAnsi" w:cstheme="majorBidi"/>
+                  </w:rPr>
+                  <w:t>Intencionadamente</w:t>
+                </w:r>
+                <w:proofErr w:type="spellEnd"/>
+                <w:r>
+                  <w:rPr>
+                    <w:rFonts w:asciiTheme="majorHAnsi" w:hAnsiTheme="majorHAnsi" w:cstheme="majorBidi"/>
+                  </w:rPr>
+                  <w:t xml:space="preserve"> </w:t>
+                </w:r>
+                <w:proofErr w:type="spellStart"/>
+                <w:r>
+                  <w:rPr>
+                    <w:rFonts w:asciiTheme="majorHAnsi" w:hAnsiTheme="majorHAnsi" w:cstheme="majorBidi"/>
+                  </w:rPr>
+                  <w:t>en</w:t>
+                </w:r>
+                <w:proofErr w:type="spellEnd"/>
+                <w:r>
+                  <w:rPr>
+                    <w:rFonts w:asciiTheme="majorHAnsi" w:hAnsiTheme="majorHAnsi" w:cstheme="majorBidi"/>
+                  </w:rPr>
+                  <w:t xml:space="preserve"> </w:t>
+                </w:r>
+                <w:proofErr w:type="spellStart"/>
+                <w:r>
+                  <w:rPr>
+                    <w:rFonts w:asciiTheme="majorHAnsi" w:hAnsiTheme="majorHAnsi" w:cstheme="majorBidi"/>
+                  </w:rPr>
+                  <w:t>blanco</w:t>
+                </w:r>
+                <w:proofErr w:type="spellEnd"/>
+                <w:r>
+                  <w:rPr>
+                    <w:rFonts w:asciiTheme="majorHAnsi" w:hAnsiTheme="majorHAnsi" w:cstheme="majorBidi"/>
+                  </w:rPr>
+                  <w:t xml:space="preserve"> </w:t>
+                </w:r>
+                <w:r>
+                  <w:rPr>
+                    <w:rFonts w:asciiTheme="majorHAnsi" w:hAnsiTheme="majorHAnsi" w:cstheme="majorBidi"/>
+                  </w:rPr>
+                  <w:t xml:space="preserve"> </w:t>
+                </w:r>
+              </w:sdtContent>
+            </w:sdt>
+            <w:permEnd w:id="386604040"/>
+          </w:p>
+          <w:p>
+            <w:pPr>
+              <w:pStyle w:val="Sinespaciado"/>
+              <w:rPr>
+                <w:rFonts w:asciiTheme="majorHAnsi" w:hAnsiTheme="majorHAnsi" w:cstheme="majorHAnsi"/>
+              </w:rPr>
+            </w:pPr>
+            <w:r>
+              <w:rPr>
+                <w:rFonts w:asciiTheme="majorHAnsi" w:hAnsiTheme="majorHAnsi" w:cstheme="majorHAnsi"/>
+                <w:b/>
+              </w:rPr>
+              <w:t>Roles:</w:t>
+            </w:r>
+            <w:r>
+              <w:rPr>
+                <w:rFonts w:asciiTheme="majorHAnsi" w:hAnsiTheme="majorHAnsi" w:cstheme="majorHAnsi"/>
+                <w:b/>
+              </w:rPr>
+              <w:tab/>
+            </w:r>
+            <w:r>
+              <w:rPr>
+                <w:rFonts w:asciiTheme="majorHAnsi" w:hAnsiTheme="majorHAnsi" w:cstheme="majorHAnsi"/>
+              </w:rPr>
+              <w:tab/>
+            </w:r>
+            <w:permStart w:id="1487353257" w:edGrp="everyone"/>
+            <w:sdt>
+              <w:sdtPr>
+                <w:rPr>
+                  <w:rFonts w:asciiTheme="majorHAnsi" w:hAnsiTheme="majorHAnsi" w:cstheme="majorBidi"/>
+                </w:rPr>
+                <w:tag w:val="Roles4"/>
+                <w:id w:val="1414657434"/>
+                <w:placeholder>
+                  <w:docPart w:val="3DB9FE5FE7F54E5B9E63A4AB2D2CB563"/>
+                </w:placeholder>
+                <w15:appearance w15:val="hidden"/>
+                <w:text/>
+              </w:sdtPr>
+              <w:sdtContent>
+                <w:r>
+                  <w:rPr>
+                    <w:rFonts w:asciiTheme="majorHAnsi" w:hAnsiTheme="majorHAnsi" w:cstheme="majorBidi"/>
+                  </w:rPr>
+                  <w:t xml:space="preserve"> </w:t>
+                </w:r>
+                <w:proofErr w:type="spellStart"/>
+                <w:r>
+                  <w:rPr>
+                    <w:rFonts w:asciiTheme="majorHAnsi" w:hAnsiTheme="majorHAnsi" w:cstheme="majorBidi"/>
+                  </w:rPr>
+                  <w:t>Intencionadamente</w:t>
+                </w:r>
+                <w:proofErr w:type="spellEnd"/>
+                <w:r>
+                  <w:rPr>
+                    <w:rFonts w:asciiTheme="majorHAnsi" w:hAnsiTheme="majorHAnsi" w:cstheme="majorBidi"/>
+                  </w:rPr>
+                  <w:t xml:space="preserve"> </w:t>
+                </w:r>
+                <w:proofErr w:type="spellStart"/>
+                <w:r>
+                  <w:rPr>
+                    <w:rFonts w:asciiTheme="majorHAnsi" w:hAnsiTheme="majorHAnsi" w:cstheme="majorBidi"/>
+                  </w:rPr>
+                  <w:t>en</w:t>
+                </w:r>
+                <w:proofErr w:type="spellEnd"/>
+                <w:r>
+                  <w:rPr>
+                    <w:rFonts w:asciiTheme="majorHAnsi" w:hAnsiTheme="majorHAnsi" w:cstheme="majorBidi"/>
+                  </w:rPr>
+                  <w:t xml:space="preserve"> </w:t>
+                </w:r>
+                <w:proofErr w:type="spellStart"/>
+                <w:r>
+                  <w:rPr>
+                    <w:rFonts w:asciiTheme="majorHAnsi" w:hAnsiTheme="majorHAnsi" w:cstheme="majorBidi"/>
+                  </w:rPr>
+                  <w:t>blanco</w:t>
+                </w:r>
+                <w:proofErr w:type="spellEnd"/>
+                <w:r>
+                  <w:rPr>
+                    <w:rFonts w:asciiTheme="majorHAnsi" w:hAnsiTheme="majorHAnsi" w:cstheme="majorBidi"/>
+                  </w:rPr>
+                  <w:t xml:space="preserve"> </w:t>
+                </w:r>
+                <w:r>
+                  <w:rPr>
+                    <w:rFonts w:asciiTheme="majorHAnsi" w:hAnsiTheme="majorHAnsi" w:cstheme="majorBidi"/>
+                  </w:rPr>
+                  <w:t xml:space="preserve"> </w:t>
+                </w:r>
+              </w:sdtContent>
+            </w:sdt>
+            <w:permEnd w:id="1487353257"/>
           </w:p>
         </w:tc>
       </w:tr>
@@ -876,7 +1652,7 @@
               </w:rPr>
               <w:tab/>
             </w:r>
-            <w:permStart w:id="797736735" w:edGrp="everyone"/>
+            <w:permStart w:id="1631927432" w:edGrp="everyone"/>
             <w:sdt>
               <w:sdtPr>
                 <w:rPr>
@@ -906,7 +1682,7 @@
               </w:sdtContent>
             </w:sdt>
           </w:p>
-          <w:permEnd w:id="797736735"/>
+          <w:permEnd w:id="1631927432"/>
           <w:p>
             <w:pPr>
               <w:pStyle w:val="Sinespaciado"/>
@@ -936,7 +1712,7 @@
               </w:rPr>
               <w:tab/>
             </w:r>
-            <w:permStart w:id="138366337" w:edGrp="everyone"/>
+            <w:permStart w:id="1398370153" w:edGrp="everyone"/>
             <w:sdt>
               <w:sdtPr>
                 <w:rPr>
@@ -971,7 +1747,7 @@
                 </w:r>
               </w:sdtContent>
             </w:sdt>
-            <w:permEnd w:id="138366337"/>
+            <w:permEnd w:id="1398370153"/>
           </w:p>
           <w:p>
             <w:pPr>
@@ -1000,7 +1776,7 @@
               </w:rPr>
               <w:tab/>
             </w:r>
-            <w:permStart w:id="53479974" w:edGrp="everyone"/>
+            <w:permStart w:id="72570348" w:edGrp="everyone"/>
             <w:sdt>
               <w:sdtPr>
                 <w:rPr>
@@ -1021,11 +1797,19 @@
                   </w:rPr>
                   <w:t xml:space="preserve"> </w:t>
                 </w:r>
+                <w:proofErr w:type="spellStart"/>
                 <w:r>
                   <w:rPr>
                     <w:rFonts w:asciiTheme="majorHAnsi" w:hAnsiTheme="majorHAnsi" w:cstheme="majorHAnsi"/>
                   </w:rPr>
-                  <w:t>Baladrón Caballero, Álvaro</w:t>
+                  <w:t>Baladrón</w:t>
+                </w:r>
+                <w:proofErr w:type="spellEnd"/>
+                <w:r>
+                  <w:rPr>
+                    <w:rFonts w:asciiTheme="majorHAnsi" w:hAnsiTheme="majorHAnsi" w:cstheme="majorHAnsi"/>
+                  </w:rPr>
+                  <w:t xml:space="preserve"> Caballero, Álvaro</w:t>
                 </w:r>
                 <w:r>
                   <w:rPr>
@@ -1035,7 +1819,7 @@
                 </w:r>
               </w:sdtContent>
             </w:sdt>
-            <w:permEnd w:id="53479974"/>
+            <w:permEnd w:id="72570348"/>
           </w:p>
           <w:p>
             <w:pPr>
@@ -1064,7 +1848,7 @@
               </w:rPr>
               <w:tab/>
             </w:r>
-            <w:permStart w:id="814876543" w:edGrp="everyone"/>
+            <w:permStart w:id="2077499526" w:edGrp="everyone"/>
             <w:sdt>
               <w:sdtPr>
                 <w:rPr>
@@ -1098,7 +1882,7 @@
                 </w:r>
               </w:sdtContent>
             </w:sdt>
-            <w:permEnd w:id="814876543"/>
+            <w:permEnd w:id="2077499526"/>
           </w:p>
         </w:tc>
         <w:tc>
@@ -1160,7 +1944,7 @@
               </w:rPr>
               <w:tab/>
             </w:r>
-            <w:permStart w:id="308288824" w:edGrp="everyone"/>
+            <w:permStart w:id="1772436159" w:edGrp="everyone"/>
             <w:sdt>
               <w:sdtPr>
                 <w:rPr>
@@ -1187,6 +1971,7 @@
                   </w:rPr>
                   <w:t xml:space="preserve">Sevilla </w:t>
                 </w:r>
+                <w:proofErr w:type="gramStart"/>
                 <w:r>
                   <w:rPr>
                     <w:rFonts w:asciiTheme="majorHAnsi" w:hAnsiTheme="majorHAnsi" w:cstheme="majorHAnsi"/>
@@ -1197,7 +1982,14 @@
                   <w:rPr>
                     <w:rFonts w:asciiTheme="majorHAnsi" w:hAnsiTheme="majorHAnsi" w:cstheme="majorHAnsi"/>
                   </w:rPr>
-                  <w:t>, 2025</w:t>
+                  <w:t>,</w:t>
+                </w:r>
+                <w:proofErr w:type="gramEnd"/>
+                <w:r>
+                  <w:rPr>
+                    <w:rFonts w:asciiTheme="majorHAnsi" w:hAnsiTheme="majorHAnsi" w:cstheme="majorHAnsi"/>
+                  </w:rPr>
+                  <w:t xml:space="preserve"> 2025</w:t>
                 </w:r>
                 <w:r>
                   <w:rPr>
@@ -1207,7 +1999,7 @@
                 </w:r>
               </w:sdtContent>
             </w:sdt>
-            <w:permEnd w:id="308288824"/>
+            <w:permEnd w:id="1772436159"/>
           </w:p>
         </w:tc>
       </w:tr>
@@ -1416,7 +2208,7 @@
       </w:r>
     </w:p>
     <w:bookmarkStart w:id="2" w:name="_Hlk157672140"/>
-    <w:permStart w:id="960173268" w:edGrp="everyone"/>
+    <w:permStart w:id="514992324" w:edGrp="everyone"/>
     <w:p>
       <w:pPr>
         <w:pStyle w:val="Comment-Grader"/>
@@ -1443,7 +2235,7 @@
           </w:r>
         </w:sdtContent>
       </w:sdt>
-      <w:permEnd w:id="960173268"/>
+      <w:permEnd w:id="514992324"/>
       <w:r>
         <w:t xml:space="preserve">   </w:t>
       </w:r>
@@ -1458,7 +2250,7 @@
       </w:r>
     </w:p>
     <w:bookmarkStart w:id="3" w:name="_Hlk157672153"/>
-    <w:permStart w:id="212422207" w:edGrp="everyone"/>
+    <w:permStart w:id="1330789551" w:edGrp="everyone"/>
     <w:p>
       <w:pPr>
         <w:pStyle w:val="Comment-Grader"/>
@@ -1485,7 +2277,7 @@
           </w:r>
         </w:sdtContent>
       </w:sdt>
-      <w:permEnd w:id="212422207"/>
+      <w:permEnd w:id="1330789551"/>
       <w:r>
         <w:t xml:space="preserve">  </w:t>
       </w:r>
@@ -1514,7 +2306,17 @@
         <w:t xml:space="preserve">, </w:t>
       </w:r>
       <w:r>
-        <w:t xml:space="preserve">their current status, </w:t>
+        <w:t xml:space="preserve">their </w:t>
+      </w:r>
+      <w:bookmarkStart w:id="4" w:name="_Int_4q4WObMb"/>
+      <w:proofErr w:type="gramStart"/>
+      <w:r>
+        <w:t>current status</w:t>
+      </w:r>
+      <w:bookmarkEnd w:id="4"/>
+      <w:proofErr w:type="gramEnd"/>
+      <w:r>
+        <w:t xml:space="preserve">, </w:t>
       </w:r>
       <w:r>
         <w:t xml:space="preserve">and </w:t>
@@ -1526,7 +2328,7 @@
         <w:t>schedule.</w:t>
       </w:r>
     </w:p>
-    <w:permStart w:id="653218351" w:edGrp="everyone"/>
+    <w:permStart w:id="263077281" w:edGrp="everyone"/>
     <w:p>
       <w:pPr>
         <w:pStyle w:val="Comment-Grader"/>
@@ -1553,7 +2355,7 @@
           </w:r>
         </w:sdtContent>
       </w:sdt>
-      <w:permEnd w:id="653218351"/>
+      <w:permEnd w:id="263077281"/>
       <w:r>
         <w:t xml:space="preserve">   </w:t>
       </w:r>
@@ -1742,19 +2544,32 @@
         </w:rPr>
         <w:t xml:space="preserve">contact phone number </w:t>
       </w:r>
-      <w:bookmarkStart w:id="4" w:name="OLE_LINK1"/>
-      <w:bookmarkStart w:id="5" w:name="OLE_LINK2"/>
-      <w:r>
-        <w:t>(pattern " ^\+?\d{</w:t>
-      </w:r>
+      <w:bookmarkStart w:id="5" w:name="OLE_LINK1"/>
+      <w:bookmarkStart w:id="6" w:name="OLE_LINK2"/>
+      <w:r>
+        <w:t>(pattern " ^\</w:t>
+      </w:r>
+      <w:proofErr w:type="gramStart"/>
+      <w:r>
+        <w:t>+?\d{</w:t>
+      </w:r>
+      <w:proofErr w:type="gramEnd"/>
       <w:r>
         <w:t>6</w:t>
       </w:r>
       <w:r>
-        <w:t>,15}$")</w:t>
-      </w:r>
-      <w:bookmarkEnd w:id="4"/>
+        <w:t>,</w:t>
+      </w:r>
+      <w:proofErr w:type="gramStart"/>
+      <w:r>
+        <w:t>15}$</w:t>
+      </w:r>
+      <w:proofErr w:type="gramEnd"/>
+      <w:r>
+        <w:t>")</w:t>
+      </w:r>
       <w:bookmarkEnd w:id="5"/>
+      <w:bookmarkEnd w:id="6"/>
       <w:r>
         <w:t xml:space="preserve">.  </w:t>
       </w:r>
@@ -1768,7 +2583,7 @@
         <w:t>; no further information about them is needed in the system.</w:t>
       </w:r>
     </w:p>
-    <w:permStart w:id="2037730084" w:edGrp="everyone"/>
+    <w:permStart w:id="3886208" w:edGrp="everyone"/>
     <w:p>
       <w:pPr>
         <w:pStyle w:val="Comment-Grader"/>
@@ -1795,7 +2610,7 @@
           </w:r>
         </w:sdtContent>
       </w:sdt>
-      <w:permEnd w:id="2037730084"/>
+      <w:permEnd w:id="3886208"/>
       <w:r>
         <w:t xml:space="preserve">  </w:t>
       </w:r>
@@ -1946,7 +2761,7 @@
         <w:t>,15}$").</w:t>
       </w:r>
     </w:p>
-    <w:permStart w:id="1975012333" w:edGrp="everyone"/>
+    <w:permStart w:id="568988877" w:edGrp="everyone"/>
     <w:p>
       <w:pPr>
         <w:pStyle w:val="Comment-Grader"/>
@@ -1973,7 +2788,7 @@
           </w:r>
         </w:sdtContent>
       </w:sdt>
-      <w:permEnd w:id="1975012333"/>
+      <w:permEnd w:id="568988877"/>
       <w:r>
         <w:t xml:space="preserve">   </w:t>
       </w:r>
@@ -2164,7 +2979,7 @@
         <w:t xml:space="preserve"> characters).</w:t>
       </w:r>
     </w:p>
-    <w:permStart w:id="1952077005" w:edGrp="everyone"/>
+    <w:permStart w:id="64176652" w:edGrp="everyone"/>
     <w:p>
       <w:pPr>
         <w:pStyle w:val="Comment-Grader"/>
@@ -2191,7 +3006,7 @@
           </w:r>
         </w:sdtContent>
       </w:sdt>
-      <w:permEnd w:id="1952077005"/>
+      <w:permEnd w:id="64176652"/>
       <w:r>
         <w:t xml:space="preserve">      </w:t>
       </w:r>
@@ -2360,7 +3175,7 @@
         <w:t xml:space="preserve">. </w:t>
       </w:r>
     </w:p>
-    <w:permStart w:id="520909001" w:edGrp="everyone"/>
+    <w:permStart w:id="2084199269" w:edGrp="everyone"/>
     <w:p>
       <w:pPr>
         <w:pStyle w:val="Comment-Grader"/>
@@ -2387,7 +3202,7 @@
           </w:r>
         </w:sdtContent>
       </w:sdt>
-      <w:permEnd w:id="520909001"/>
+      <w:permEnd w:id="2084199269"/>
       <w:r>
         <w:t xml:space="preserve">   </w:t>
       </w:r>
@@ -2603,7 +3418,7 @@
         <w:t xml:space="preserve"> or not. </w:t>
       </w:r>
     </w:p>
-    <w:permStart w:id="1024669070" w:edGrp="everyone"/>
+    <w:permStart w:id="1789663349" w:edGrp="everyone"/>
     <w:p>
       <w:pPr>
         <w:pStyle w:val="Comment-Grader"/>
@@ -2630,7 +3445,7 @@
           </w:r>
         </w:sdtContent>
       </w:sdt>
-      <w:permEnd w:id="1024669070"/>
+      <w:permEnd w:id="1789663349"/>
       <w:r>
         <w:t xml:space="preserve">   </w:t>
       </w:r>
@@ -2737,7 +3552,7 @@
         <w:t>”.</w:t>
       </w:r>
     </w:p>
-    <w:permStart w:id="940329759" w:edGrp="everyone"/>
+    <w:permStart w:id="1472210995" w:edGrp="everyone"/>
     <w:p>
       <w:pPr>
         <w:pStyle w:val="Comment-Grader"/>
@@ -2764,7 +3579,7 @@
           </w:r>
         </w:sdtContent>
       </w:sdt>
-      <w:permEnd w:id="940329759"/>
+      <w:permEnd w:id="1472210995"/>
       <w:r>
         <w:t xml:space="preserve">    </w:t>
       </w:r>
@@ -2806,8 +3621,13 @@
         <w:t xml:space="preserve">, </w:t>
       </w:r>
       <w:r>
-        <w:t>their current status</w:t>
-      </w:r>
+        <w:t xml:space="preserve">their </w:t>
+      </w:r>
+      <w:proofErr w:type="gramStart"/>
+      <w:r>
+        <w:t>current status</w:t>
+      </w:r>
+      <w:proofErr w:type="gramEnd"/>
       <w:r>
         <w:t>, and your schedule</w:t>
       </w:r>
@@ -2815,7 +3635,7 @@
         <w:t>.</w:t>
       </w:r>
     </w:p>
-    <w:permStart w:id="222523439" w:edGrp="everyone"/>
+    <w:permStart w:id="1506941238" w:edGrp="everyone"/>
     <w:p>
       <w:pPr>
         <w:pStyle w:val="Comment-Grader"/>
@@ -2842,7 +3662,7 @@
           </w:r>
         </w:sdtContent>
       </w:sdt>
-      <w:permEnd w:id="222523439"/>
+      <w:permEnd w:id="1506941238"/>
       <w:r>
         <w:t xml:space="preserve">    </w:t>
       </w:r>
@@ -2981,7 +3801,7 @@
         <w:t>require confirmation.</w:t>
       </w:r>
     </w:p>
-    <w:permStart w:id="1983741739" w:edGrp="everyone"/>
+    <w:permStart w:id="877278202" w:edGrp="everyone"/>
     <w:p>
       <w:pPr>
         <w:pStyle w:val="Comment-Grader"/>
@@ -3008,7 +3828,7 @@
           </w:r>
         </w:sdtContent>
       </w:sdt>
-      <w:permEnd w:id="1983741739"/>
+      <w:permEnd w:id="877278202"/>
     </w:p>
     <w:p>
       <w:pPr>
@@ -3072,7 +3892,7 @@
         <w:t xml:space="preserve"> Both operations require confirmation.</w:t>
       </w:r>
     </w:p>
-    <w:permStart w:id="1359305475" w:edGrp="everyone"/>
+    <w:permStart w:id="793719138" w:edGrp="everyone"/>
     <w:p>
       <w:pPr>
         <w:pStyle w:val="Comment-Grader"/>
@@ -3099,7 +3919,7 @@
           </w:r>
         </w:sdtContent>
       </w:sdt>
-      <w:permEnd w:id="1359305475"/>
+      <w:permEnd w:id="793719138"/>
       <w:r>
         <w:t xml:space="preserve">   </w:t>
       </w:r>
@@ -3163,7 +3983,7 @@
         <w:t>operations require confirmation.</w:t>
       </w:r>
     </w:p>
-    <w:permStart w:id="2024236755" w:edGrp="everyone"/>
+    <w:permStart w:id="1433148399" w:edGrp="everyone"/>
     <w:p>
       <w:pPr>
         <w:pStyle w:val="Comment-Grader"/>
@@ -3190,7 +4010,7 @@
           </w:r>
         </w:sdtContent>
       </w:sdt>
-      <w:permEnd w:id="2024236755"/>
+      <w:permEnd w:id="1433148399"/>
       <w:r>
         <w:t xml:space="preserve">   </w:t>
       </w:r>
@@ -3243,7 +4063,7 @@
         <w:t>); the services must be promoted in every page as little intrusively as possible.</w:t>
       </w:r>
     </w:p>
-    <w:permStart w:id="364344351" w:edGrp="everyone"/>
+    <w:permStart w:id="1002920657" w:edGrp="everyone"/>
     <w:p>
       <w:pPr>
         <w:pStyle w:val="Comment-Grader"/>
@@ -3270,7 +4090,7 @@
           </w:r>
         </w:sdtContent>
       </w:sdt>
-      <w:permEnd w:id="364344351"/>
+      <w:permEnd w:id="1002920657"/>
       <w:r>
         <w:t xml:space="preserve">   </w:t>
       </w:r>
@@ -3341,10 +4161,18 @@
         <w:pStyle w:val="Requirement-Header"/>
       </w:pPr>
       <w:r>
-        <w:t>Provide a link to your planning dashboard in GitHub to review the tasks, their current status, and your schedule.</w:t>
-      </w:r>
-    </w:p>
-    <w:permStart w:id="1084897338" w:edGrp="everyone"/>
+        <w:t xml:space="preserve">Provide a link to your planning dashboard in GitHub to review the tasks, their </w:t>
+      </w:r>
+      <w:proofErr w:type="gramStart"/>
+      <w:r>
+        <w:t>current status</w:t>
+      </w:r>
+      <w:proofErr w:type="gramEnd"/>
+      <w:r>
+        <w:t>, and your schedule.</w:t>
+      </w:r>
+    </w:p>
+    <w:permStart w:id="1902000534" w:edGrp="everyone"/>
     <w:p>
       <w:pPr>
         <w:pStyle w:val="Comment-Grader"/>
@@ -3371,7 +4199,7 @@
           </w:r>
         </w:sdtContent>
       </w:sdt>
-      <w:permEnd w:id="1084897338"/>
+      <w:permEnd w:id="1902000534"/>
       <w:r>
         <w:t xml:space="preserve">  </w:t>
       </w:r>
@@ -3434,7 +4262,7 @@
         <w:t xml:space="preserve">Create appropriate indexes for your entities, if required. </w:t>
       </w:r>
     </w:p>
-    <w:permStart w:id="2004747747" w:edGrp="everyone"/>
+    <w:permStart w:id="47063208" w:edGrp="everyone"/>
     <w:p>
       <w:pPr>
         <w:pStyle w:val="Comment-Grader"/>
@@ -3461,7 +4289,7 @@
           </w:r>
         </w:sdtContent>
       </w:sdt>
-      <w:permEnd w:id="2004747747"/>
+      <w:permEnd w:id="47063208"/>
       <w:r>
         <w:t xml:space="preserve">   </w:t>
       </w:r>
@@ -3535,7 +4363,7 @@
         <w:t>.</w:t>
       </w:r>
     </w:p>
-    <w:permStart w:id="511801055" w:edGrp="everyone"/>
+    <w:permStart w:id="759059702" w:edGrp="everyone"/>
     <w:p>
       <w:pPr>
         <w:pStyle w:val="Comment-Grader"/>
@@ -3562,7 +4390,7 @@
           </w:r>
         </w:sdtContent>
       </w:sdt>
-      <w:permEnd w:id="511801055"/>
+      <w:permEnd w:id="759059702"/>
       <w:r>
         <w:t xml:space="preserve">  </w:t>
       </w:r>
@@ -3586,13 +4414,21 @@
         <w:pStyle w:val="Requirement-Header"/>
       </w:pPr>
       <w:r>
-        <w:t>Provide a link to your planning dashboard in GitHub to review the tasks, their current status, and your schedule.</w:t>
+        <w:t xml:space="preserve">Provide a link to your planning dashboard in GitHub to review the tasks, their </w:t>
+      </w:r>
+      <w:proofErr w:type="gramStart"/>
+      <w:r>
+        <w:t>current status</w:t>
+      </w:r>
+      <w:proofErr w:type="gramEnd"/>
+      <w:r>
+        <w:t>, and your schedule.</w:t>
       </w:r>
       <w:r>
         <w:t xml:space="preserve">  </w:t>
       </w:r>
     </w:p>
-    <w:permStart w:id="75725101" w:edGrp="everyone"/>
+    <w:permStart w:id="1340033691" w:edGrp="everyone"/>
     <w:p>
       <w:pPr>
         <w:pStyle w:val="Comment-Grader"/>
@@ -3619,7 +4455,7 @@
           </w:r>
         </w:sdtContent>
       </w:sdt>
-      <w:permEnd w:id="75725101"/>
+      <w:permEnd w:id="1340033691"/>
       <w:r>
         <w:t xml:space="preserve">   </w:t>
       </w:r>
@@ -3632,7 +4468,7 @@
         <w:t xml:space="preserve">Produce a testing report. </w:t>
       </w:r>
     </w:p>
-    <w:permStart w:id="432682287" w:edGrp="everyone"/>
+    <w:permStart w:id="867524682" w:edGrp="everyone"/>
     <w:p>
       <w:pPr>
         <w:pStyle w:val="Comment-Grader"/>
@@ -3659,7 +4495,7 @@
           </w:r>
         </w:sdtContent>
       </w:sdt>
-      <w:permEnd w:id="432682287"/>
+      <w:permEnd w:id="867524682"/>
       <w:r>
         <w:t xml:space="preserve">   </w:t>
       </w:r>
@@ -3810,7 +4646,7 @@
         <w:t>.</w:t>
       </w:r>
     </w:p>
-    <w:permStart w:id="372120531" w:edGrp="everyone"/>
+    <w:permStart w:id="322599070" w:edGrp="everyone"/>
     <w:p>
       <w:pPr>
         <w:pStyle w:val="Comment-Grader"/>
@@ -3837,7 +4673,7 @@
           </w:r>
         </w:sdtContent>
       </w:sdt>
-      <w:permEnd w:id="372120531"/>
+      <w:permEnd w:id="322599070"/>
       <w:r>
         <w:t xml:space="preserve">      </w:t>
       </w:r>
@@ -3889,7 +4725,7 @@
         <w:t>Produce a report on what you knew about the architecture of a WIS before this subject. </w:t>
       </w:r>
     </w:p>
-    <w:permStart w:id="1755387810" w:edGrp="everyone"/>
+    <w:permStart w:id="1262108067" w:edGrp="everyone"/>
     <w:p>
       <w:pPr>
         <w:pStyle w:val="Comment-Grader"/>
@@ -3910,7 +4746,7 @@
           </w:r>
         </w:sdtContent>
       </w:sdt>
-      <w:permEnd w:id="1755387810"/>
+      <w:permEnd w:id="1262108067"/>
       <w:r>
         <w:t xml:space="preserve">   </w:t>
       </w:r>
@@ -3923,7 +4759,7 @@
         <w:t>Produce a report on what you knew about testing a WIS before this subject. </w:t>
       </w:r>
     </w:p>
-    <w:permStart w:id="1085613373" w:edGrp="everyone"/>
+    <w:permStart w:id="2072198547" w:edGrp="everyone"/>
     <w:p>
       <w:pPr>
         <w:pStyle w:val="Comment-Grader"/>
@@ -3944,7 +4780,7 @@
           </w:r>
         </w:sdtContent>
       </w:sdt>
-      <w:permEnd w:id="1085613373"/>
+      <w:permEnd w:id="2072198547"/>
       <w:r>
         <w:t xml:space="preserve">  </w:t>
       </w:r>
@@ -3972,7 +4808,7 @@
         <w:t>, and you have your development configuration ready to work.</w:t>
       </w:r>
     </w:p>
-    <w:permStart w:id="595926935" w:edGrp="everyone"/>
+    <w:permStart w:id="893265149" w:edGrp="everyone"/>
     <w:p>
       <w:pPr>
         <w:pStyle w:val="Comment-Grader"/>
@@ -3999,7 +4835,7 @@
           </w:r>
         </w:sdtContent>
       </w:sdt>
-      <w:permEnd w:id="595926935"/>
+      <w:permEnd w:id="893265149"/>
       <w:r>
         <w:t xml:space="preserve">   </w:t>
       </w:r>
@@ -4092,7 +4928,7 @@
         <w:t>, which must be initialised to “EUR”, “USD”, and “GBP”. </w:t>
       </w:r>
     </w:p>
-    <w:permStart w:id="1722642685" w:edGrp="everyone"/>
+    <w:permStart w:id="1208632185" w:edGrp="everyone"/>
     <w:p>
       <w:pPr>
         <w:pStyle w:val="Comment-Grader"/>
@@ -4113,7 +4949,7 @@
           </w:r>
         </w:sdtContent>
       </w:sdt>
-      <w:permEnd w:id="1722642685"/>
+      <w:permEnd w:id="1208632185"/>
       <w:r>
         <w:t xml:space="preserve">     </w:t>
       </w:r>
@@ -4228,7 +5064,7 @@
         <w:t>verage, minimum, maximum, and standard deviation of the number of reviews posted over the last 10 weeks.</w:t>
       </w:r>
     </w:p>
-    <w:permStart w:id="71390633" w:edGrp="everyone"/>
+    <w:permStart w:id="230453759" w:edGrp="everyone"/>
     <w:p>
       <w:pPr>
         <w:pStyle w:val="Comment-Grader"/>
@@ -4249,7 +5085,7 @@
           </w:r>
         </w:sdtContent>
       </w:sdt>
-      <w:permEnd w:id="71390633"/>
+      <w:permEnd w:id="230453759"/>
       <w:r>
         <w:t xml:space="preserve">   </w:t>
       </w:r>
@@ -4357,7 +5193,7 @@
         <w:t>. </w:t>
       </w:r>
     </w:p>
-    <w:permStart w:id="1571051714" w:edGrp="everyone"/>
+    <w:permStart w:id="732176783" w:edGrp="everyone"/>
     <w:p>
       <w:pPr>
         <w:pStyle w:val="Comment-Grader"/>
@@ -4384,7 +5220,7 @@
           </w:r>
         </w:sdtContent>
       </w:sdt>
-      <w:permEnd w:id="1571051714"/>
+      <w:permEnd w:id="732176783"/>
       <w:r>
         <w:t xml:space="preserve">    </w:t>
       </w:r>
@@ -4517,7 +5353,7 @@
         <w:t>the services.</w:t>
       </w:r>
     </w:p>
-    <w:permStart w:id="1870346029" w:edGrp="everyone"/>
+    <w:permStart w:id="1985440427" w:edGrp="everyone"/>
     <w:p>
       <w:pPr>
         <w:pStyle w:val="Comment-Grader"/>
@@ -4538,7 +5374,7 @@
           </w:r>
         </w:sdtContent>
       </w:sdt>
-      <w:permEnd w:id="1870346029"/>
+      <w:permEnd w:id="1985440427"/>
       <w:r>
         <w:t xml:space="preserve">   </w:t>
       </w:r>
@@ -4616,7 +5452,7 @@
         <w:t>This operation requires a confirmation since reviews cannot be updated or deleted.</w:t>
       </w:r>
     </w:p>
-    <w:permStart w:id="1857453914" w:edGrp="everyone"/>
+    <w:permStart w:id="1070278833" w:edGrp="everyone"/>
     <w:p>
       <w:pPr>
         <w:pStyle w:val="Comment-Grader"/>
@@ -4637,7 +5473,7 @@
           </w:r>
         </w:sdtContent>
       </w:sdt>
-      <w:permEnd w:id="1857453914"/>
+      <w:permEnd w:id="1070278833"/>
       <w:r>
         <w:t xml:space="preserve">   </w:t>
       </w:r>
@@ -4692,7 +5528,7 @@
         <w:t>Update the system configuration. </w:t>
       </w:r>
     </w:p>
-    <w:permStart w:id="21825355" w:edGrp="everyone"/>
+    <w:permStart w:id="1694506261" w:edGrp="everyone"/>
     <w:p>
       <w:pPr>
         <w:pStyle w:val="Comment-Grader"/>
@@ -4713,7 +5549,7 @@
           </w:r>
         </w:sdtContent>
       </w:sdt>
-      <w:permEnd w:id="21825355"/>
+      <w:permEnd w:id="1694506261"/>
       <w:r>
         <w:t xml:space="preserve">   </w:t>
       </w:r>
@@ -4771,7 +5607,7 @@
         <w:t xml:space="preserve">. </w:t>
       </w:r>
     </w:p>
-    <w:permStart w:id="1302208211" w:edGrp="everyone"/>
+    <w:permStart w:id="2084703222" w:edGrp="everyone"/>
     <w:p>
       <w:pPr>
         <w:pStyle w:val="Comment-Grader"/>
@@ -4792,7 +5628,7 @@
           </w:r>
         </w:sdtContent>
       </w:sdt>
-      <w:permEnd w:id="1302208211"/>
+      <w:permEnd w:id="2084703222"/>
       <w:r>
         <w:t xml:space="preserve">   </w:t>
       </w:r>
@@ -4842,7 +5678,7 @@
         <w:t>. </w:t>
       </w:r>
     </w:p>
-    <w:permStart w:id="1075993270" w:edGrp="everyone"/>
+    <w:permStart w:id="2120495563" w:edGrp="everyone"/>
     <w:p>
       <w:pPr>
         <w:pStyle w:val="Comment-Grader"/>
@@ -4863,16 +5699,16 @@
           </w:r>
         </w:sdtContent>
       </w:sdt>
-      <w:permEnd w:id="1075993270"/>
+      <w:permEnd w:id="2120495563"/>
       <w:r>
         <w:t xml:space="preserve">   </w:t>
       </w:r>
-      <w:bookmarkStart w:id="6" w:name="_Hlk157672549"/>
+      <w:bookmarkStart w:id="7" w:name="_Hlk157672549"/>
       <w:r>
         <w:t xml:space="preserve">  </w:t>
       </w:r>
     </w:p>
-    <w:bookmarkEnd w:id="6"/>
+    <w:bookmarkEnd w:id="7"/>
     <w:p>
       <w:pPr>
         <w:pStyle w:val="Ttulo2"/>
@@ -4926,7 +5762,7 @@
         <w:t xml:space="preserve">. </w:t>
       </w:r>
     </w:p>
-    <w:permStart w:id="1791297325" w:edGrp="everyone"/>
+    <w:permStart w:id="422514435" w:edGrp="everyone"/>
     <w:p>
       <w:pPr>
         <w:pStyle w:val="Comment-Grader"/>
@@ -4947,7 +5783,7 @@
           </w:r>
         </w:sdtContent>
       </w:sdt>
-      <w:permEnd w:id="1791297325"/>
+      <w:permEnd w:id="422514435"/>
     </w:p>
     <w:p>
       <w:pPr>
@@ -5020,7 +5856,7 @@
         <w:t>.</w:t>
       </w:r>
     </w:p>
-    <w:permStart w:id="787628737" w:edGrp="everyone"/>
+    <w:permStart w:id="433923951" w:edGrp="everyone"/>
     <w:p>
       <w:pPr>
         <w:pStyle w:val="Comment-Grader"/>
@@ -5041,7 +5877,7 @@
           </w:r>
         </w:sdtContent>
       </w:sdt>
-      <w:permEnd w:id="787628737"/>
+      <w:permEnd w:id="433923951"/>
       <w:r>
         <w:t xml:space="preserve">     </w:t>
       </w:r>
@@ -5176,7 +6012,7 @@
         <w:t>report on the results.</w:t>
       </w:r>
     </w:p>
-    <w:permStart w:id="887307482" w:edGrp="everyone"/>
+    <w:permStart w:id="1465547332" w:edGrp="everyone"/>
     <w:p>
       <w:pPr>
         <w:pStyle w:val="Comment-Grader"/>
@@ -5197,7 +6033,7 @@
           </w:r>
         </w:sdtContent>
       </w:sdt>
-      <w:permEnd w:id="887307482"/>
+      <w:permEnd w:id="1465547332"/>
       <w:r>
         <w:t xml:space="preserve">  </w:t>
       </w:r>
@@ -5224,7 +6060,7 @@
         <w:t>Produce a lint report.</w:t>
       </w:r>
     </w:p>
-    <w:permStart w:id="2026124554" w:edGrp="everyone"/>
+    <w:permStart w:id="2056024124" w:edGrp="everyone"/>
     <w:p>
       <w:pPr>
         <w:pStyle w:val="Comment-Grader"/>
@@ -5245,7 +6081,7 @@
           </w:r>
         </w:sdtContent>
       </w:sdt>
-      <w:permEnd w:id="2026124554"/>
+      <w:permEnd w:id="2056024124"/>
       <w:r>
         <w:t xml:space="preserve">          </w:t>
       </w:r>
@@ -5413,7 +6249,7 @@
         <w:t>Produce an analysis report.</w:t>
       </w:r>
     </w:p>
-    <w:permStart w:id="890782365" w:edGrp="everyone"/>
+    <w:permStart w:id="358632476" w:edGrp="everyone"/>
     <w:p>
       <w:pPr>
         <w:pStyle w:val="Comment-Grader"/>
@@ -5434,7 +6270,7 @@
           </w:r>
         </w:sdtContent>
       </w:sdt>
-      <w:permEnd w:id="890782365"/>
+      <w:permEnd w:id="358632476"/>
       <w:r>
         <w:t xml:space="preserve">   </w:t>
       </w:r>
@@ -5447,7 +6283,7 @@
         <w:t>Produce a planning and progress report.</w:t>
       </w:r>
     </w:p>
-    <w:permStart w:id="2083326338" w:edGrp="everyone"/>
+    <w:permStart w:id="1731732844" w:edGrp="everyone"/>
     <w:p>
       <w:pPr>
         <w:pStyle w:val="Comment-Grader"/>
@@ -5468,7 +6304,7 @@
           </w:r>
         </w:sdtContent>
       </w:sdt>
-      <w:permEnd w:id="2083326338"/>
+      <w:permEnd w:id="1731732844"/>
       <w:r>
         <w:t xml:space="preserve">   </w:t>
       </w:r>
@@ -5683,7 +6519,7 @@
         <w:t xml:space="preserve"> (in the past) to indicate whether the passenger is still banned or if the prohibition has been lifted. </w:t>
       </w:r>
     </w:p>
-    <w:permStart w:id="952376566" w:edGrp="everyone"/>
+    <w:permStart w:id="1815554783" w:edGrp="everyone"/>
     <w:p>
       <w:pPr>
         <w:pStyle w:val="Comment-Grader"/>
@@ -5704,7 +6540,7 @@
           </w:r>
         </w:sdtContent>
       </w:sdt>
-      <w:permEnd w:id="952376566"/>
+      <w:permEnd w:id="1815554783"/>
       <w:r>
         <w:t xml:space="preserve"> </w:t>
       </w:r>
@@ -5772,7 +6608,7 @@
         <w:t>pay-per-use services!  This requirement must be fulfilled in this and every other group or individual deliverable for it to be considered satisfied. </w:t>
       </w:r>
     </w:p>
-    <w:permStart w:id="159606273" w:edGrp="everyone"/>
+    <w:permStart w:id="1408045569" w:edGrp="everyone"/>
     <w:p>
       <w:pPr>
         <w:pStyle w:val="Comment-Grader"/>
@@ -5793,7 +6629,7 @@
           </w:r>
         </w:sdtContent>
       </w:sdt>
-      <w:permEnd w:id="159606273"/>
+      <w:permEnd w:id="1408045569"/>
       <w:r>
         <w:t xml:space="preserve">  </w:t>
       </w:r>
@@ -5848,7 +6684,7 @@
         <w:t>Produce an analysis report.</w:t>
       </w:r>
     </w:p>
-    <w:permStart w:id="411374720" w:edGrp="everyone"/>
+    <w:permStart w:id="1362912911" w:edGrp="everyone"/>
     <w:p>
       <w:pPr>
         <w:pStyle w:val="Comment-Grader"/>
@@ -5869,7 +6705,7 @@
           </w:r>
         </w:sdtContent>
       </w:sdt>
-      <w:permEnd w:id="411374720"/>
+      <w:permEnd w:id="1362912911"/>
       <w:r>
         <w:t xml:space="preserve">   </w:t>
       </w:r>
@@ -5882,7 +6718,7 @@
         <w:t>Produce a planning and progress report.</w:t>
       </w:r>
     </w:p>
-    <w:permStart w:id="2044158838" w:edGrp="everyone"/>
+    <w:permStart w:id="2031892606" w:edGrp="everyone"/>
     <w:p>
       <w:pPr>
         <w:pStyle w:val="Comment-Grader"/>
@@ -5903,7 +6739,7 @@
           </w:r>
         </w:sdtContent>
       </w:sdt>
-      <w:permEnd w:id="2044158838"/>
+      <w:permEnd w:id="2031892606"/>
       <w:r>
         <w:t xml:space="preserve">  </w:t>
       </w:r>
@@ -6085,7 +6921,7 @@
         <w:t>.</w:t>
       </w:r>
     </w:p>
-    <w:permStart w:id="198931914" w:edGrp="everyone"/>
+    <w:permStart w:id="991234116" w:edGrp="everyone"/>
     <w:p>
       <w:pPr>
         <w:pStyle w:val="Comment-Grader"/>
@@ -6106,7 +6942,7 @@
           </w:r>
         </w:sdtContent>
       </w:sdt>
-      <w:permEnd w:id="198931914"/>
+      <w:permEnd w:id="991234116"/>
       <w:r>
         <w:t xml:space="preserve">   </w:t>
       </w:r>
@@ -6163,7 +6999,7 @@
         <w:t>.</w:t>
       </w:r>
     </w:p>
-    <w:permStart w:id="1307185674" w:edGrp="everyone"/>
+    <w:permStart w:id="745096751" w:edGrp="everyone"/>
     <w:p>
       <w:pPr>
         <w:pStyle w:val="Comment-Grader"/>
@@ -6184,7 +7020,7 @@
           </w:r>
         </w:sdtContent>
       </w:sdt>
-      <w:permEnd w:id="1307185674"/>
+      <w:permEnd w:id="745096751"/>
       <w:r>
         <w:t xml:space="preserve">   </w:t>
       </w:r>
@@ -6347,7 +7183,31 @@
         <w:t xml:space="preserve"> by removing any punctuation between consecutive letters</w:t>
       </w:r>
       <w:r>
-        <w:t xml:space="preserve"> (e.g., "S.E.X", "H:A:R:D C:O:R:E", or "V*I:AG!$R-A")</w:t>
+        <w:t xml:space="preserve"> (e.g., "S.E.X", "</w:t>
+      </w:r>
+      <w:proofErr w:type="gramStart"/>
+      <w:r>
+        <w:t>H:A</w:t>
+      </w:r>
+      <w:proofErr w:type="gramEnd"/>
+      <w:r>
+        <w:t>:R:D C</w:t>
+      </w:r>
+      <w:proofErr w:type="gramStart"/>
+      <w:r>
+        <w:t>:O:R</w:t>
+      </w:r>
+      <w:proofErr w:type="gramEnd"/>
+      <w:r>
+        <w:t>:E", or "V*I:</w:t>
+      </w:r>
+      <w:proofErr w:type="gramStart"/>
+      <w:r>
+        <w:t>AG!$</w:t>
+      </w:r>
+      <w:proofErr w:type="gramEnd"/>
+      <w:r>
+        <w:t>R-A")</w:t>
       </w:r>
       <w:r>
         <w:t xml:space="preserve">. </w:t>
@@ -6421,6 +7281,7 @@
         </w:rPr>
         <w:t xml:space="preserve">* </w:t>
       </w:r>
+      <w:proofErr w:type="gramStart"/>
       <w:r>
         <w:t>M</w:t>
       </w:r>
@@ -6430,9 +7291,11 @@
       <w:r>
         <w:t>i</w:t>
       </w:r>
+      <w:proofErr w:type="gramEnd"/>
       <w:r>
         <w:t>:</w:t>
       </w:r>
+      <w:proofErr w:type="gramStart"/>
       <w:r>
         <w:t>L</w:t>
       </w:r>
@@ -6442,12 +7305,14 @@
       <w:r>
         <w:t>L</w:t>
       </w:r>
+      <w:proofErr w:type="gramEnd"/>
       <w:r>
         <w:t>:</w:t>
       </w:r>
       <w:r>
         <w:t>i</w:t>
       </w:r>
+      <w:proofErr w:type="gramStart"/>
       <w:r>
         <w:t>:</w:t>
       </w:r>
@@ -6458,7 +7323,11 @@
         <w:t>:</w:t>
       </w:r>
       <w:r>
-        <w:t>n”</w:t>
+        <w:t>n</w:t>
+      </w:r>
+      <w:proofErr w:type="gramEnd"/>
+      <w:r>
+        <w:t>”</w:t>
       </w:r>
       <w:r>
         <w:t>,</w:t>
@@ -6620,7 +7489,7 @@
         <w:t>group or individual deliverables for it to be considered valid.</w:t>
       </w:r>
     </w:p>
-    <w:permStart w:id="1665162078" w:edGrp="everyone"/>
+    <w:permStart w:id="361393539" w:edGrp="everyone"/>
     <w:p>
       <w:pPr>
         <w:pStyle w:val="Comment-Grader"/>
@@ -6641,7 +7510,7 @@
           </w:r>
         </w:sdtContent>
       </w:sdt>
-      <w:permEnd w:id="1665162078"/>
+      <w:permEnd w:id="361393539"/>
       <w:r>
         <w:t xml:space="preserve">  </w:t>
       </w:r>
@@ -6694,7 +7563,7 @@
         <w:t>Produce an analysis report.</w:t>
       </w:r>
     </w:p>
-    <w:permStart w:id="1337547296" w:edGrp="everyone"/>
+    <w:permStart w:id="833295285" w:edGrp="everyone"/>
     <w:p>
       <w:pPr>
         <w:pStyle w:val="Comment-Grader"/>
@@ -6715,7 +7584,7 @@
           </w:r>
         </w:sdtContent>
       </w:sdt>
-      <w:permEnd w:id="1337547296"/>
+      <w:permEnd w:id="833295285"/>
       <w:r>
         <w:t xml:space="preserve">   </w:t>
       </w:r>
@@ -6728,7 +7597,7 @@
         <w:t>Produce a planning and progress report.</w:t>
       </w:r>
     </w:p>
-    <w:permStart w:id="1168391617" w:edGrp="everyone"/>
+    <w:permStart w:id="1514348030" w:edGrp="everyone"/>
     <w:p>
       <w:pPr>
         <w:pStyle w:val="Comment-Grader"/>
@@ -6749,7 +7618,7 @@
           </w:r>
         </w:sdtContent>
       </w:sdt>
-      <w:permEnd w:id="1168391617"/>
+      <w:permEnd w:id="1514348030"/>
       <w:r>
         <w:t xml:space="preserve">     </w:t>
       </w:r>
@@ -6902,7 +7771,7 @@
         <w:t>is properly mocked.</w:t>
       </w:r>
     </w:p>
-    <w:permStart w:id="1302428298" w:edGrp="everyone"/>
+    <w:permStart w:id="2092566320" w:edGrp="everyone"/>
     <w:p>
       <w:pPr>
         <w:pStyle w:val="Comment-Grader"/>
@@ -6923,7 +7792,7 @@
           </w:r>
         </w:sdtContent>
       </w:sdt>
-      <w:permEnd w:id="1302428298"/>
+      <w:permEnd w:id="2092566320"/>
       <w:r>
         <w:t xml:space="preserve">  </w:t>
       </w:r>
@@ -6950,7 +7819,7 @@
         <w:t>Produce an analysis report.</w:t>
       </w:r>
     </w:p>
-    <w:permStart w:id="1172982747" w:edGrp="everyone"/>
+    <w:permStart w:id="1306342161" w:edGrp="everyone"/>
     <w:p>
       <w:pPr>
         <w:pStyle w:val="Comment-Grader"/>
@@ -6971,7 +7840,7 @@
           </w:r>
         </w:sdtContent>
       </w:sdt>
-      <w:permEnd w:id="1172982747"/>
+      <w:permEnd w:id="1306342161"/>
       <w:r>
         <w:t xml:space="preserve">     </w:t>
       </w:r>
@@ -6984,7 +7853,7 @@
         <w:t>Produce a planning and progress report.</w:t>
       </w:r>
     </w:p>
-    <w:permStart w:id="1531737391" w:edGrp="everyone"/>
+    <w:permStart w:id="1978161967" w:edGrp="everyone"/>
     <w:p>
       <w:pPr>
         <w:pStyle w:val="Comment-Grader"/>
@@ -7005,7 +7874,7 @@
           </w:r>
         </w:sdtContent>
       </w:sdt>
-      <w:permEnd w:id="1531737391"/>
+      <w:permEnd w:id="1978161967"/>
       <w:r>
         <w:t xml:space="preserve">      </w:t>
       </w:r>
@@ -7027,6 +7896,9 @@
     <int2:textHash int2:hashCode="apbFNxt1DCEnbZ" int2:id="76W5FpX8">
       <int2:state int2:value="Rejected" int2:type="AugLoop_Text_Critique"/>
     </int2:textHash>
+    <int2:bookmark int2:bookmarkName="_Int_4q4WObMb" int2:invalidationBookmarkName="" int2:hashCode="QHQfPOTE7MbsPj" int2:id="Ns9iK2Rs">
+      <int2:state int2:value="Rejected" int2:type="AugLoop_Text_Critique"/>
+    </int2:bookmark>
   </int2:observations>
   <int2:intelligenceSettings/>
   <int2:onDemandWorkflows/>
@@ -8766,6 +9638,93 @@
     </w:docPart>
     <w:docPart>
       <w:docPartPr>
+        <w:name w:val="6F786DCD649A47158871CD1D613BC7CC"/>
+        <w:category>
+          <w:name w:val="General"/>
+          <w:gallery w:val="placeholder"/>
+        </w:category>
+        <w:types>
+          <w:type w:val="bbPlcHdr"/>
+        </w:types>
+        <w:behaviors>
+          <w:behavior w:val="content"/>
+        </w:behaviors>
+        <w:guid w:val="{9E835996-0619-46A3-A1D0-655D60E34AD5}"/>
+      </w:docPartPr>
+      <w:docPartBody>
+        <w:p>
+          <w:pPr>
+            <w:pStyle w:val="6F786DCD649A47158871CD1D613BC7CC"/>
+          </w:pPr>
+          <w:r>
+            <w:rPr>
+              <w:rStyle w:val="Textodelmarcadordeposicin"/>
+            </w:rPr>
+            <w:t>Haga clic o pulse aquí para escribir texto.</w:t>
+          </w:r>
+        </w:p>
+      </w:docPartBody>
+    </w:docPart>
+    <w:docPart>
+      <w:docPartPr>
+        <w:name w:val="A5481AD88EA342BBAAB11D688719DEDB"/>
+        <w:category>
+          <w:name w:val="General"/>
+          <w:gallery w:val="placeholder"/>
+        </w:category>
+        <w:types>
+          <w:type w:val="bbPlcHdr"/>
+        </w:types>
+        <w:behaviors>
+          <w:behavior w:val="content"/>
+        </w:behaviors>
+        <w:guid w:val="{C3222A93-8F1E-4705-87F7-D1C024F91F8A}"/>
+      </w:docPartPr>
+      <w:docPartBody>
+        <w:p>
+          <w:pPr>
+            <w:pStyle w:val="A5481AD88EA342BBAAB11D688719DEDB"/>
+          </w:pPr>
+          <w:r>
+            <w:rPr>
+              <w:rStyle w:val="Textodelmarcadordeposicin"/>
+            </w:rPr>
+            <w:t>Haga clic o pulse aquí para escribir texto.</w:t>
+          </w:r>
+        </w:p>
+      </w:docPartBody>
+    </w:docPart>
+    <w:docPart>
+      <w:docPartPr>
+        <w:name w:val="E9193D3C494241F4B256126F24FB602E"/>
+        <w:category>
+          <w:name w:val="General"/>
+          <w:gallery w:val="placeholder"/>
+        </w:category>
+        <w:types>
+          <w:type w:val="bbPlcHdr"/>
+        </w:types>
+        <w:behaviors>
+          <w:behavior w:val="content"/>
+        </w:behaviors>
+        <w:guid w:val="{E83085DB-158E-48BA-BAB3-35BDBB6BBD2B}"/>
+      </w:docPartPr>
+      <w:docPartBody>
+        <w:p>
+          <w:pPr>
+            <w:pStyle w:val="E9193D3C494241F4B256126F24FB602E"/>
+          </w:pPr>
+          <w:r>
+            <w:rPr>
+              <w:rStyle w:val="Textodelmarcadordeposicin"/>
+            </w:rPr>
+            <w:t>Haga clic o pulse aquí para escribir texto.</w:t>
+          </w:r>
+        </w:p>
+      </w:docPartBody>
+    </w:docPart>
+    <w:docPart>
+      <w:docPartPr>
         <w:name w:val="FE6C20A3138E4520815E1903DF6AF182"/>
         <w:category>
           <w:name w:val="General"/>
@@ -8870,6 +9829,93 @@
         <w:p>
           <w:pPr>
             <w:pStyle w:val="FABB13D4D8384F839954E76BD25A68A6"/>
+          </w:pPr>
+          <w:r>
+            <w:rPr>
+              <w:rStyle w:val="Textodelmarcadordeposicin"/>
+            </w:rPr>
+            <w:t>Haga clic o pulse aquí para escribir texto.</w:t>
+          </w:r>
+        </w:p>
+      </w:docPartBody>
+    </w:docPart>
+    <w:docPart>
+      <w:docPartPr>
+        <w:name w:val="D9A40BD86CA043A99F41FFEC09CF32C5"/>
+        <w:category>
+          <w:name w:val="General"/>
+          <w:gallery w:val="placeholder"/>
+        </w:category>
+        <w:types>
+          <w:type w:val="bbPlcHdr"/>
+        </w:types>
+        <w:behaviors>
+          <w:behavior w:val="content"/>
+        </w:behaviors>
+        <w:guid w:val="{27B93908-B731-4430-A263-2834D31B5608}"/>
+      </w:docPartPr>
+      <w:docPartBody>
+        <w:p>
+          <w:pPr>
+            <w:pStyle w:val="D9A40BD86CA043A99F41FFEC09CF32C5"/>
+          </w:pPr>
+          <w:r>
+            <w:rPr>
+              <w:rStyle w:val="Textodelmarcadordeposicin"/>
+            </w:rPr>
+            <w:t>Haga clic o pulse aquí para escribir texto.</w:t>
+          </w:r>
+        </w:p>
+      </w:docPartBody>
+    </w:docPart>
+    <w:docPart>
+      <w:docPartPr>
+        <w:name w:val="83AB65E9A82B4E5D8F27694A6CD354D0"/>
+        <w:category>
+          <w:name w:val="General"/>
+          <w:gallery w:val="placeholder"/>
+        </w:category>
+        <w:types>
+          <w:type w:val="bbPlcHdr"/>
+        </w:types>
+        <w:behaviors>
+          <w:behavior w:val="content"/>
+        </w:behaviors>
+        <w:guid w:val="{0B207B61-258B-4C43-9A3A-F5530B99770F}"/>
+      </w:docPartPr>
+      <w:docPartBody>
+        <w:p>
+          <w:pPr>
+            <w:pStyle w:val="83AB65E9A82B4E5D8F27694A6CD354D0"/>
+          </w:pPr>
+          <w:r>
+            <w:rPr>
+              <w:rStyle w:val="Textodelmarcadordeposicin"/>
+            </w:rPr>
+            <w:t>Haga clic o pulse aquí para escribir texto.</w:t>
+          </w:r>
+        </w:p>
+      </w:docPartBody>
+    </w:docPart>
+    <w:docPart>
+      <w:docPartPr>
+        <w:name w:val="3DB9FE5FE7F54E5B9E63A4AB2D2CB563"/>
+        <w:category>
+          <w:name w:val="General"/>
+          <w:gallery w:val="placeholder"/>
+        </w:category>
+        <w:types>
+          <w:type w:val="bbPlcHdr"/>
+        </w:types>
+        <w:behaviors>
+          <w:behavior w:val="content"/>
+        </w:behaviors>
+        <w:guid w:val="{5FA0DEAE-0F86-4A14-AD40-C285DD0D3247}"/>
+      </w:docPartPr>
+      <w:docPartBody>
+        <w:p>
+          <w:pPr>
+            <w:pStyle w:val="3DB9FE5FE7F54E5B9E63A4AB2D2CB563"/>
           </w:pPr>
           <w:r>
             <w:rPr>
@@ -10552,9 +11598,8 @@
     <w:rsid w:val="001942D6"/>
     <w:rsid w:val="001C5FFF"/>
     <w:rsid w:val="00260AAC"/>
+    <w:rsid w:val="002901B0"/>
     <w:rsid w:val="00336824"/>
-    <w:rsid w:val="00341D30"/>
-    <w:rsid w:val="003544B1"/>
     <w:rsid w:val="00364D10"/>
     <w:rsid w:val="003A10F7"/>
     <w:rsid w:val="003B5C99"/>
@@ -10595,7 +11640,6 @@
     <w:rsid w:val="00940F51"/>
     <w:rsid w:val="00946AA5"/>
     <w:rsid w:val="00953D97"/>
-    <w:rsid w:val="009D587E"/>
     <w:rsid w:val="009F61B1"/>
     <w:rsid w:val="00A011E1"/>
     <w:rsid w:val="00A04483"/>
@@ -10603,14 +11647,12 @@
     <w:rsid w:val="00A222AC"/>
     <w:rsid w:val="00A61663"/>
     <w:rsid w:val="00A73E76"/>
-    <w:rsid w:val="00A77A6B"/>
     <w:rsid w:val="00AC1FAB"/>
-    <w:rsid w:val="00B440C0"/>
     <w:rsid w:val="00B55352"/>
     <w:rsid w:val="00BB0EAB"/>
-    <w:rsid w:val="00BE669A"/>
     <w:rsid w:val="00C06868"/>
     <w:rsid w:val="00C17266"/>
+    <w:rsid w:val="00C45C7C"/>
     <w:rsid w:val="00C63AB0"/>
     <w:rsid w:val="00C9535D"/>
     <w:rsid w:val="00CC57B2"/>
@@ -10625,12 +11667,10 @@
     <w:rsid w:val="00E9745E"/>
     <w:rsid w:val="00EB4EB9"/>
     <w:rsid w:val="00F3606D"/>
-    <w:rsid w:val="00F41F8F"/>
     <w:rsid w:val="00F6703B"/>
     <w:rsid w:val="00F70A20"/>
     <w:rsid w:val="00F8539E"/>
     <w:rsid w:val="00F970E5"/>
-    <w:rsid w:val="00FD452D"/>
     <w:rsid w:val="00FE6BFD"/>
   </w:rsids>
   <m:mathPr>

</xml_diff>